<commit_message>
Corrigidos e revisados os casos de uso 12, 13, 14, 15
</commit_message>
<xml_diff>
--- a/Requisitos/CSU12 - Gerenciar Avaliações.docx
+++ b/Requisitos/CSU12 - Gerenciar Avaliações.docx
@@ -1,6 +1,6 @@
 
 <file path=word/document.xml><?xml version="1.0" encoding="utf-8"?>
-<w:document xmlns:wpc="http://schemas.microsoft.com/office/word/2010/wordprocessingCanvas" xmlns:cx="http://schemas.microsoft.com/office/drawing/2014/chartex" xmlns:cx1="http://schemas.microsoft.com/office/drawing/2015/9/8/chartex" xmlns:cx2="http://schemas.microsoft.com/office/drawing/2015/10/21/chartex" xmlns:cx3="http://schemas.microsoft.com/office/drawing/2016/5/9/chartex" xmlns:cx4="http://schemas.microsoft.com/office/drawing/2016/5/10/chartex" xmlns:cx5="http://schemas.microsoft.com/office/drawing/2016/5/11/chartex" xmlns:cx6="http://schemas.microsoft.com/office/drawing/2016/5/12/chartex" xmlns:cx7="http://schemas.microsoft.com/office/drawing/2016/5/13/chartex" xmlns:cx8="http://schemas.microsoft.com/office/drawing/2016/5/14/chartex" xmlns:mc="http://schemas.openxmlformats.org/markup-compatibility/2006" xmlns:aink="http://schemas.microsoft.com/office/drawing/2016/ink" xmlns:am3d="http://schemas.microsoft.com/office/drawing/2017/model3d" xmlns:o="urn:schemas-microsoft-com:office:office" xmlns:r="http://schemas.openxmlformats.org/officeDocument/2006/relationships" xmlns:m="http://schemas.openxmlformats.org/officeDocument/2006/math" xmlns:v="urn:schemas-microsoft-com:vml" xmlns:wp14="http://schemas.microsoft.com/office/word/2010/wordprocessingDrawing" xmlns:wp="http://schemas.openxmlformats.org/drawingml/2006/wordprocessingDrawing" xmlns:w10="urn:schemas-microsoft-com:office:word" xmlns:w="http://schemas.openxmlformats.org/wordprocessingml/2006/main" xmlns:w14="http://schemas.microsoft.com/office/word/2010/wordml" xmlns:w15="http://schemas.microsoft.com/office/word/2012/wordml" xmlns:w16cex="http://schemas.microsoft.com/office/word/2018/wordml/cex" xmlns:w16cid="http://schemas.microsoft.com/office/word/2016/wordml/cid" xmlns:w16="http://schemas.microsoft.com/office/word/2018/wordml" xmlns:w16se="http://schemas.microsoft.com/office/word/2015/wordml/symex" xmlns:wpg="http://schemas.microsoft.com/office/word/2010/wordprocessingGroup" xmlns:wpi="http://schemas.microsoft.com/office/word/2010/wordprocessingInk" xmlns:wne="http://schemas.microsoft.com/office/word/2006/wordml" xmlns:wps="http://schemas.microsoft.com/office/word/2010/wordprocessingShape" mc:Ignorable="w14 w15 w16se w16cid w16 w16cex wp14">
+<w:document xmlns:wpc="http://schemas.microsoft.com/office/word/2010/wordprocessingCanvas" xmlns:mc="http://schemas.openxmlformats.org/markup-compatibility/2006" xmlns:o="urn:schemas-microsoft-com:office:office" xmlns:r="http://schemas.openxmlformats.org/officeDocument/2006/relationships" xmlns:m="http://schemas.openxmlformats.org/officeDocument/2006/math" xmlns:v="urn:schemas-microsoft-com:vml" xmlns:wp14="http://schemas.microsoft.com/office/word/2010/wordprocessingDrawing" xmlns:wp="http://schemas.openxmlformats.org/drawingml/2006/wordprocessingDrawing" xmlns:w="http://schemas.openxmlformats.org/wordprocessingml/2006/main" xmlns:w14="http://schemas.microsoft.com/office/word/2010/wordml" xmlns:w10="urn:schemas-microsoft-com:office:word" xmlns:w15="http://schemas.microsoft.com/office/word/2012/wordml" xmlns:wpg="http://schemas.microsoft.com/office/word/2010/wordprocessingGroup" xmlns:wpi="http://schemas.microsoft.com/office/word/2010/wordprocessingInk" xmlns:wne="http://schemas.microsoft.com/office/word/2006/wordml" xmlns:wps="http://schemas.microsoft.com/office/word/2010/wordprocessingShape" xmlns:wpsCustomData="http://www.wps.cn/officeDocument/2013/wpsCustomData" mc:Ignorable="w14 w15 wp14">
   <w:body>
     <w:p>
       <w:pPr>
@@ -18,16 +18,7 @@
           <w:sz w:val="36"/>
           <w:szCs w:val="36"/>
         </w:rPr>
-        <w:t>CSU</w:t>
-      </w:r>
-      <w:r>
-        <w:rPr>
-          <w:b/>
-          <w:color w:val="FF0000"/>
-          <w:sz w:val="36"/>
-          <w:szCs w:val="36"/>
-        </w:rPr>
-        <w:t>12</w:t>
+        <w:t>CSU12</w:t>
       </w:r>
       <w:r>
         <w:rPr>
@@ -35,15 +26,7 @@
           <w:sz w:val="36"/>
           <w:szCs w:val="36"/>
         </w:rPr>
-        <w:t>-</w:t>
-      </w:r>
-      <w:r>
-        <w:rPr>
-          <w:b/>
-          <w:sz w:val="36"/>
-          <w:szCs w:val="36"/>
-        </w:rPr>
-        <w:t>Gerenciar Avaliações</w:t>
+        <w:t>-Gerenciar Avaliações</w:t>
       </w:r>
     </w:p>
     <w:p>
@@ -82,25 +65,38 @@
     </w:p>
     <w:tbl>
       <w:tblPr>
-        <w:tblStyle w:val="a2"/>
+        <w:tblStyle w:val="33"/>
         <w:tblW w:w="10391" w:type="dxa"/>
         <w:tblInd w:w="-70" w:type="dxa"/>
         <w:tblLayout w:type="fixed"/>
-        <w:tblLook w:val="0000" w:firstRow="0" w:lastRow="0" w:firstColumn="0" w:lastColumn="0" w:noHBand="0" w:noVBand="0"/>
+        <w:tblCellMar>
+          <w:top w:w="0" w:type="dxa"/>
+          <w:left w:w="70" w:type="dxa"/>
+          <w:bottom w:w="0" w:type="dxa"/>
+          <w:right w:w="70" w:type="dxa"/>
+        </w:tblCellMar>
       </w:tblPr>
       <w:tblGrid>
         <w:gridCol w:w="2788"/>
         <w:gridCol w:w="7603"/>
       </w:tblGrid>
       <w:tr>
+        <w:tblPrEx>
+          <w:tblCellMar>
+            <w:top w:w="0" w:type="dxa"/>
+            <w:left w:w="70" w:type="dxa"/>
+            <w:bottom w:w="0" w:type="dxa"/>
+            <w:right w:w="70" w:type="dxa"/>
+          </w:tblCellMar>
+        </w:tblPrEx>
         <w:tc>
           <w:tcPr>
             <w:tcW w:w="2788" w:type="dxa"/>
             <w:tcBorders>
-              <w:top w:val="single" w:sz="4" w:space="0" w:color="000000"/>
-              <w:left w:val="single" w:sz="4" w:space="0" w:color="000000"/>
-              <w:bottom w:val="single" w:sz="4" w:space="0" w:color="000000"/>
-              <w:right w:val="single" w:sz="4" w:space="0" w:color="000000"/>
+              <w:top w:val="single" w:color="000000" w:sz="4" w:space="0"/>
+              <w:left w:val="single" w:color="000000" w:sz="4" w:space="0"/>
+              <w:bottom w:val="single" w:color="000000" w:sz="4" w:space="0"/>
+              <w:right w:val="single" w:color="000000" w:sz="4" w:space="0"/>
             </w:tcBorders>
             <w:shd w:val="clear" w:color="auto" w:fill="auto"/>
           </w:tcPr>
@@ -119,54 +115,41 @@
           <w:tcPr>
             <w:tcW w:w="7603" w:type="dxa"/>
             <w:tcBorders>
-              <w:top w:val="single" w:sz="4" w:space="0" w:color="000000"/>
-              <w:left w:val="single" w:sz="4" w:space="0" w:color="000000"/>
-              <w:bottom w:val="single" w:sz="4" w:space="0" w:color="000000"/>
-              <w:right w:val="single" w:sz="4" w:space="0" w:color="000000"/>
-            </w:tcBorders>
-            <w:shd w:val="clear" w:color="auto" w:fill="auto"/>
-          </w:tcPr>
-          <w:p>
-            <w:r>
-              <w:rPr>
-                <w:sz w:val="28"/>
-                <w:szCs w:val="28"/>
-              </w:rPr>
-              <w:t>50</w:t>
-            </w:r>
-            <w:r>
-              <w:rPr>
-                <w:sz w:val="28"/>
-                <w:szCs w:val="28"/>
-              </w:rPr>
-              <w:t xml:space="preserve">  (Risco Baixo e Prioridade </w:t>
-            </w:r>
-            <w:r>
-              <w:rPr>
-                <w:sz w:val="28"/>
-                <w:szCs w:val="28"/>
-              </w:rPr>
-              <w:t>Baixa</w:t>
-            </w:r>
-            <w:r>
-              <w:rPr>
-                <w:sz w:val="28"/>
-                <w:szCs w:val="28"/>
-              </w:rPr>
-              <w:t>)</w:t>
+              <w:top w:val="single" w:color="000000" w:sz="4" w:space="0"/>
+              <w:left w:val="single" w:color="000000" w:sz="4" w:space="0"/>
+              <w:bottom w:val="single" w:color="000000" w:sz="4" w:space="0"/>
+              <w:right w:val="single" w:color="000000" w:sz="4" w:space="0"/>
+            </w:tcBorders>
+            <w:shd w:val="clear" w:color="auto" w:fill="auto"/>
+          </w:tcPr>
+          <w:p>
+            <w:r>
+              <w:rPr>
+                <w:sz w:val="28"/>
+                <w:szCs w:val="28"/>
+              </w:rPr>
+              <w:t>50  (Risco Baixo e Prioridade Baixa)</w:t>
             </w:r>
           </w:p>
         </w:tc>
       </w:tr>
       <w:tr>
+        <w:tblPrEx>
+          <w:tblCellMar>
+            <w:top w:w="0" w:type="dxa"/>
+            <w:left w:w="70" w:type="dxa"/>
+            <w:bottom w:w="0" w:type="dxa"/>
+            <w:right w:w="70" w:type="dxa"/>
+          </w:tblCellMar>
+        </w:tblPrEx>
         <w:tc>
           <w:tcPr>
             <w:tcW w:w="2788" w:type="dxa"/>
             <w:tcBorders>
-              <w:top w:val="single" w:sz="4" w:space="0" w:color="000000"/>
-              <w:left w:val="single" w:sz="4" w:space="0" w:color="000000"/>
-              <w:bottom w:val="single" w:sz="4" w:space="0" w:color="000000"/>
-              <w:right w:val="single" w:sz="4" w:space="0" w:color="000000"/>
+              <w:top w:val="single" w:color="000000" w:sz="4" w:space="0"/>
+              <w:left w:val="single" w:color="000000" w:sz="4" w:space="0"/>
+              <w:bottom w:val="single" w:color="000000" w:sz="4" w:space="0"/>
+              <w:right w:val="single" w:color="000000" w:sz="4" w:space="0"/>
             </w:tcBorders>
             <w:shd w:val="clear" w:color="auto" w:fill="auto"/>
           </w:tcPr>
@@ -185,10 +168,10 @@
           <w:tcPr>
             <w:tcW w:w="7603" w:type="dxa"/>
             <w:tcBorders>
-              <w:top w:val="single" w:sz="4" w:space="0" w:color="000000"/>
-              <w:left w:val="single" w:sz="4" w:space="0" w:color="000000"/>
-              <w:bottom w:val="single" w:sz="4" w:space="0" w:color="000000"/>
-              <w:right w:val="single" w:sz="4" w:space="0" w:color="000000"/>
+              <w:top w:val="single" w:color="000000" w:sz="4" w:space="0"/>
+              <w:left w:val="single" w:color="000000" w:sz="4" w:space="0"/>
+              <w:bottom w:val="single" w:color="000000" w:sz="4" w:space="0"/>
+              <w:right w:val="single" w:color="000000" w:sz="4" w:space="0"/>
             </w:tcBorders>
             <w:shd w:val="clear" w:color="auto" w:fill="auto"/>
           </w:tcPr>
@@ -204,14 +187,22 @@
         </w:tc>
       </w:tr>
       <w:tr>
+        <w:tblPrEx>
+          <w:tblCellMar>
+            <w:top w:w="0" w:type="dxa"/>
+            <w:left w:w="70" w:type="dxa"/>
+            <w:bottom w:w="0" w:type="dxa"/>
+            <w:right w:w="70" w:type="dxa"/>
+          </w:tblCellMar>
+        </w:tblPrEx>
         <w:tc>
           <w:tcPr>
             <w:tcW w:w="2788" w:type="dxa"/>
             <w:tcBorders>
-              <w:top w:val="single" w:sz="4" w:space="0" w:color="000000"/>
-              <w:left w:val="single" w:sz="4" w:space="0" w:color="000000"/>
-              <w:bottom w:val="single" w:sz="4" w:space="0" w:color="000000"/>
-              <w:right w:val="single" w:sz="4" w:space="0" w:color="000000"/>
+              <w:top w:val="single" w:color="000000" w:sz="4" w:space="0"/>
+              <w:left w:val="single" w:color="000000" w:sz="4" w:space="0"/>
+              <w:bottom w:val="single" w:color="000000" w:sz="4" w:space="0"/>
+              <w:right w:val="single" w:color="000000" w:sz="4" w:space="0"/>
             </w:tcBorders>
             <w:shd w:val="clear" w:color="auto" w:fill="auto"/>
           </w:tcPr>
@@ -230,10 +221,10 @@
           <w:tcPr>
             <w:tcW w:w="7603" w:type="dxa"/>
             <w:tcBorders>
-              <w:top w:val="single" w:sz="4" w:space="0" w:color="000000"/>
-              <w:left w:val="single" w:sz="4" w:space="0" w:color="000000"/>
-              <w:bottom w:val="single" w:sz="4" w:space="0" w:color="000000"/>
-              <w:right w:val="single" w:sz="4" w:space="0" w:color="000000"/>
+              <w:top w:val="single" w:color="000000" w:sz="4" w:space="0"/>
+              <w:left w:val="single" w:color="000000" w:sz="4" w:space="0"/>
+              <w:bottom w:val="single" w:color="000000" w:sz="4" w:space="0"/>
+              <w:right w:val="single" w:color="000000" w:sz="4" w:space="0"/>
             </w:tcBorders>
             <w:shd w:val="clear" w:color="auto" w:fill="auto"/>
           </w:tcPr>
@@ -249,14 +240,22 @@
         </w:tc>
       </w:tr>
       <w:tr>
+        <w:tblPrEx>
+          <w:tblCellMar>
+            <w:top w:w="0" w:type="dxa"/>
+            <w:left w:w="70" w:type="dxa"/>
+            <w:bottom w:w="0" w:type="dxa"/>
+            <w:right w:w="70" w:type="dxa"/>
+          </w:tblCellMar>
+        </w:tblPrEx>
         <w:tc>
           <w:tcPr>
             <w:tcW w:w="2788" w:type="dxa"/>
             <w:tcBorders>
-              <w:top w:val="single" w:sz="4" w:space="0" w:color="000000"/>
-              <w:left w:val="single" w:sz="4" w:space="0" w:color="000000"/>
-              <w:bottom w:val="single" w:sz="4" w:space="0" w:color="000000"/>
-              <w:right w:val="single" w:sz="4" w:space="0" w:color="000000"/>
+              <w:top w:val="single" w:color="000000" w:sz="4" w:space="0"/>
+              <w:left w:val="single" w:color="000000" w:sz="4" w:space="0"/>
+              <w:bottom w:val="single" w:color="000000" w:sz="4" w:space="0"/>
+              <w:right w:val="single" w:color="000000" w:sz="4" w:space="0"/>
             </w:tcBorders>
             <w:shd w:val="clear" w:color="auto" w:fill="auto"/>
           </w:tcPr>
@@ -275,10 +274,10 @@
           <w:tcPr>
             <w:tcW w:w="7603" w:type="dxa"/>
             <w:tcBorders>
-              <w:top w:val="single" w:sz="4" w:space="0" w:color="000000"/>
-              <w:left w:val="single" w:sz="4" w:space="0" w:color="000000"/>
-              <w:bottom w:val="single" w:sz="4" w:space="0" w:color="000000"/>
-              <w:right w:val="single" w:sz="4" w:space="0" w:color="000000"/>
+              <w:top w:val="single" w:color="000000" w:sz="4" w:space="0"/>
+              <w:left w:val="single" w:color="000000" w:sz="4" w:space="0"/>
+              <w:bottom w:val="single" w:color="000000" w:sz="4" w:space="0"/>
+              <w:right w:val="single" w:color="000000" w:sz="4" w:space="0"/>
             </w:tcBorders>
             <w:shd w:val="clear" w:color="auto" w:fill="auto"/>
           </w:tcPr>
@@ -286,14 +285,22 @@
         </w:tc>
       </w:tr>
       <w:tr>
+        <w:tblPrEx>
+          <w:tblCellMar>
+            <w:top w:w="0" w:type="dxa"/>
+            <w:left w:w="70" w:type="dxa"/>
+            <w:bottom w:w="0" w:type="dxa"/>
+            <w:right w:w="70" w:type="dxa"/>
+          </w:tblCellMar>
+        </w:tblPrEx>
         <w:tc>
           <w:tcPr>
             <w:tcW w:w="2788" w:type="dxa"/>
             <w:tcBorders>
-              <w:top w:val="single" w:sz="4" w:space="0" w:color="000000"/>
-              <w:left w:val="single" w:sz="4" w:space="0" w:color="000000"/>
-              <w:bottom w:val="single" w:sz="4" w:space="0" w:color="000000"/>
-              <w:right w:val="single" w:sz="4" w:space="0" w:color="000000"/>
+              <w:top w:val="single" w:color="000000" w:sz="4" w:space="0"/>
+              <w:left w:val="single" w:color="000000" w:sz="4" w:space="0"/>
+              <w:bottom w:val="single" w:color="000000" w:sz="4" w:space="0"/>
+              <w:right w:val="single" w:color="000000" w:sz="4" w:space="0"/>
             </w:tcBorders>
             <w:shd w:val="clear" w:color="auto" w:fill="auto"/>
           </w:tcPr>
@@ -312,10 +319,10 @@
           <w:tcPr>
             <w:tcW w:w="7603" w:type="dxa"/>
             <w:tcBorders>
-              <w:top w:val="single" w:sz="4" w:space="0" w:color="000000"/>
-              <w:left w:val="single" w:sz="4" w:space="0" w:color="000000"/>
-              <w:bottom w:val="single" w:sz="4" w:space="0" w:color="000000"/>
-              <w:right w:val="single" w:sz="4" w:space="0" w:color="000000"/>
+              <w:top w:val="single" w:color="000000" w:sz="4" w:space="0"/>
+              <w:left w:val="single" w:color="000000" w:sz="4" w:space="0"/>
+              <w:bottom w:val="single" w:color="000000" w:sz="4" w:space="0"/>
+              <w:right w:val="single" w:color="000000" w:sz="4" w:space="0"/>
             </w:tcBorders>
             <w:shd w:val="clear" w:color="auto" w:fill="auto"/>
           </w:tcPr>
@@ -353,14 +360,22 @@
         </w:tc>
       </w:tr>
       <w:tr>
+        <w:tblPrEx>
+          <w:tblCellMar>
+            <w:top w:w="0" w:type="dxa"/>
+            <w:left w:w="70" w:type="dxa"/>
+            <w:bottom w:w="0" w:type="dxa"/>
+            <w:right w:w="70" w:type="dxa"/>
+          </w:tblCellMar>
+        </w:tblPrEx>
         <w:tc>
           <w:tcPr>
             <w:tcW w:w="2788" w:type="dxa"/>
             <w:tcBorders>
-              <w:top w:val="single" w:sz="4" w:space="0" w:color="000000"/>
-              <w:left w:val="single" w:sz="4" w:space="0" w:color="000000"/>
-              <w:bottom w:val="single" w:sz="4" w:space="0" w:color="000000"/>
-              <w:right w:val="single" w:sz="4" w:space="0" w:color="000000"/>
+              <w:top w:val="single" w:color="000000" w:sz="4" w:space="0"/>
+              <w:left w:val="single" w:color="000000" w:sz="4" w:space="0"/>
+              <w:bottom w:val="single" w:color="000000" w:sz="4" w:space="0"/>
+              <w:right w:val="single" w:color="000000" w:sz="4" w:space="0"/>
             </w:tcBorders>
             <w:shd w:val="clear" w:color="auto" w:fill="auto"/>
           </w:tcPr>
@@ -379,10 +394,10 @@
           <w:tcPr>
             <w:tcW w:w="7603" w:type="dxa"/>
             <w:tcBorders>
-              <w:top w:val="single" w:sz="4" w:space="0" w:color="000000"/>
-              <w:left w:val="single" w:sz="4" w:space="0" w:color="000000"/>
-              <w:bottom w:val="single" w:sz="4" w:space="0" w:color="000000"/>
-              <w:right w:val="single" w:sz="4" w:space="0" w:color="000000"/>
+              <w:top w:val="single" w:color="000000" w:sz="4" w:space="0"/>
+              <w:left w:val="single" w:color="000000" w:sz="4" w:space="0"/>
+              <w:bottom w:val="single" w:color="000000" w:sz="4" w:space="0"/>
+              <w:right w:val="single" w:color="000000" w:sz="4" w:space="0"/>
             </w:tcBorders>
             <w:shd w:val="clear" w:color="auto" w:fill="auto"/>
           </w:tcPr>
@@ -398,6 +413,14 @@
         </w:tc>
       </w:tr>
       <w:tr>
+        <w:tblPrEx>
+          <w:tblCellMar>
+            <w:top w:w="0" w:type="dxa"/>
+            <w:left w:w="70" w:type="dxa"/>
+            <w:bottom w:w="0" w:type="dxa"/>
+            <w:right w:w="70" w:type="dxa"/>
+          </w:tblCellMar>
+        </w:tblPrEx>
         <w:trPr>
           <w:cantSplit/>
         </w:trPr>
@@ -406,16 +429,16 @@
             <w:tcW w:w="10391" w:type="dxa"/>
             <w:gridSpan w:val="2"/>
             <w:tcBorders>
-              <w:top w:val="single" w:sz="4" w:space="0" w:color="000000"/>
-              <w:left w:val="single" w:sz="4" w:space="0" w:color="000000"/>
-              <w:bottom w:val="single" w:sz="4" w:space="0" w:color="000000"/>
-              <w:right w:val="single" w:sz="4" w:space="0" w:color="000000"/>
-            </w:tcBorders>
-            <w:shd w:val="clear" w:color="auto" w:fill="auto"/>
-          </w:tcPr>
-          <w:p>
-            <w:pPr>
-              <w:pStyle w:val="Ttulo2"/>
+              <w:top w:val="single" w:color="000000" w:sz="4" w:space="0"/>
+              <w:left w:val="single" w:color="000000" w:sz="4" w:space="0"/>
+              <w:bottom w:val="single" w:color="000000" w:sz="4" w:space="0"/>
+              <w:right w:val="single" w:color="000000" w:sz="4" w:space="0"/>
+            </w:tcBorders>
+            <w:shd w:val="clear" w:color="auto" w:fill="auto"/>
+          </w:tcPr>
+          <w:p>
+            <w:pPr>
+              <w:pStyle w:val="3"/>
               <w:numPr>
                 <w:ilvl w:val="1"/>
                 <w:numId w:val="1"/>
@@ -433,15 +456,23 @@
         </w:tc>
       </w:tr>
       <w:tr>
+        <w:tblPrEx>
+          <w:tblCellMar>
+            <w:top w:w="0" w:type="dxa"/>
+            <w:left w:w="70" w:type="dxa"/>
+            <w:bottom w:w="0" w:type="dxa"/>
+            <w:right w:w="70" w:type="dxa"/>
+          </w:tblCellMar>
+        </w:tblPrEx>
         <w:tc>
           <w:tcPr>
             <w:tcW w:w="10391" w:type="dxa"/>
             <w:gridSpan w:val="2"/>
             <w:tcBorders>
-              <w:top w:val="single" w:sz="4" w:space="0" w:color="000000"/>
-              <w:left w:val="single" w:sz="4" w:space="0" w:color="000000"/>
-              <w:bottom w:val="single" w:sz="4" w:space="0" w:color="000000"/>
-              <w:right w:val="single" w:sz="4" w:space="0" w:color="000000"/>
+              <w:top w:val="single" w:color="000000" w:sz="4" w:space="0"/>
+              <w:left w:val="single" w:color="000000" w:sz="4" w:space="0"/>
+              <w:bottom w:val="single" w:color="000000" w:sz="4" w:space="0"/>
+              <w:right w:val="single" w:color="000000" w:sz="4" w:space="0"/>
             </w:tcBorders>
             <w:shd w:val="clear" w:color="auto" w:fill="auto"/>
           </w:tcPr>
@@ -458,28 +489,7 @@
                 <w:sz w:val="28"/>
                 <w:szCs w:val="28"/>
               </w:rPr>
-              <w:t>1. Ator seleciona</w:t>
-            </w:r>
-            <w:r>
-              <w:rPr>
-                <w:sz w:val="28"/>
-                <w:szCs w:val="28"/>
-              </w:rPr>
-              <w:t xml:space="preserve"> a opção</w:t>
-            </w:r>
-            <w:r>
-              <w:rPr>
-                <w:sz w:val="28"/>
-                <w:szCs w:val="28"/>
-              </w:rPr>
-              <w:t xml:space="preserve"> </w:t>
-            </w:r>
-            <w:r>
-              <w:rPr>
-                <w:sz w:val="28"/>
-                <w:szCs w:val="28"/>
-              </w:rPr>
-              <w:t>“Menu” exibido na tela “Gestor de Pedidos” (</w:t>
+              <w:t>1. Ator seleciona a opção “Menu” exibido na tela “Gestor de Pedidos” (</w:t>
             </w:r>
             <w:r>
               <w:rPr>
@@ -487,7 +497,17 @@
                 <w:sz w:val="28"/>
                 <w:szCs w:val="28"/>
               </w:rPr>
-              <w:t>Tela_W1</w:t>
+              <w:t>Tela_W</w:t>
+            </w:r>
+            <w:r>
+              <w:rPr>
+                <w:rFonts w:hint="default"/>
+                <w:color w:val="FF0000"/>
+                <w:sz w:val="28"/>
+                <w:szCs w:val="28"/>
+                <w:lang w:val="pt-BR"/>
+              </w:rPr>
+              <w:t>1</w:t>
             </w:r>
             <w:r>
               <w:rPr>
@@ -588,7 +608,23 @@
                 <w:sz w:val="28"/>
                 <w:szCs w:val="28"/>
               </w:rPr>
-              <w:t>5. Ator seleciona aba de pesquisa “Buscar avaliação” e digita o nome do cliente que deseja procurar</w:t>
+              <w:t>5. Ator seleciona aba de pesquisa “</w:t>
+            </w:r>
+            <w:r>
+              <w:rPr>
+                <w:rFonts w:hint="default"/>
+                <w:sz w:val="28"/>
+                <w:szCs w:val="28"/>
+                <w:lang w:val="pt-BR"/>
+              </w:rPr>
+              <w:t xml:space="preserve">Pesquisar </w:t>
+            </w:r>
+            <w:r>
+              <w:rPr>
+                <w:sz w:val="28"/>
+                <w:szCs w:val="28"/>
+              </w:rPr>
+              <w:t>avaliação” e digita o nome do cliente que deseja procurar</w:t>
             </w:r>
           </w:p>
           <w:p>
@@ -610,15 +646,23 @@
         </w:tc>
       </w:tr>
       <w:tr>
+        <w:tblPrEx>
+          <w:tblCellMar>
+            <w:top w:w="0" w:type="dxa"/>
+            <w:left w:w="70" w:type="dxa"/>
+            <w:bottom w:w="0" w:type="dxa"/>
+            <w:right w:w="70" w:type="dxa"/>
+          </w:tblCellMar>
+        </w:tblPrEx>
         <w:tc>
           <w:tcPr>
             <w:tcW w:w="10391" w:type="dxa"/>
             <w:gridSpan w:val="2"/>
             <w:tcBorders>
-              <w:top w:val="single" w:sz="4" w:space="0" w:color="000000"/>
-              <w:left w:val="single" w:sz="4" w:space="0" w:color="000000"/>
-              <w:bottom w:val="single" w:sz="4" w:space="0" w:color="000000"/>
-              <w:right w:val="single" w:sz="4" w:space="0" w:color="000000"/>
+              <w:top w:val="single" w:color="000000" w:sz="4" w:space="0"/>
+              <w:left w:val="single" w:color="000000" w:sz="4" w:space="0"/>
+              <w:bottom w:val="single" w:color="000000" w:sz="4" w:space="0"/>
+              <w:right w:val="single" w:color="000000" w:sz="4" w:space="0"/>
             </w:tcBorders>
             <w:shd w:val="clear" w:color="auto" w:fill="auto"/>
           </w:tcPr>
@@ -644,15 +688,23 @@
         </w:tc>
       </w:tr>
       <w:tr>
+        <w:tblPrEx>
+          <w:tblCellMar>
+            <w:top w:w="0" w:type="dxa"/>
+            <w:left w:w="70" w:type="dxa"/>
+            <w:bottom w:w="0" w:type="dxa"/>
+            <w:right w:w="70" w:type="dxa"/>
+          </w:tblCellMar>
+        </w:tblPrEx>
         <w:tc>
           <w:tcPr>
             <w:tcW w:w="10391" w:type="dxa"/>
             <w:gridSpan w:val="2"/>
             <w:tcBorders>
-              <w:top w:val="single" w:sz="4" w:space="0" w:color="000000"/>
-              <w:left w:val="single" w:sz="4" w:space="0" w:color="000000"/>
-              <w:bottom w:val="single" w:sz="4" w:space="0" w:color="000000"/>
-              <w:right w:val="single" w:sz="4" w:space="0" w:color="000000"/>
+              <w:top w:val="single" w:color="000000" w:sz="4" w:space="0"/>
+              <w:left w:val="single" w:color="000000" w:sz="4" w:space="0"/>
+              <w:bottom w:val="single" w:color="000000" w:sz="4" w:space="0"/>
+              <w:right w:val="single" w:color="000000" w:sz="4" w:space="0"/>
             </w:tcBorders>
             <w:shd w:val="clear" w:color="auto" w:fill="auto"/>
           </w:tcPr>
@@ -685,24 +737,32 @@
         </w:tc>
       </w:tr>
       <w:tr>
+        <w:tblPrEx>
+          <w:tblCellMar>
+            <w:top w:w="0" w:type="dxa"/>
+            <w:left w:w="70" w:type="dxa"/>
+            <w:bottom w:w="0" w:type="dxa"/>
+            <w:right w:w="70" w:type="dxa"/>
+          </w:tblCellMar>
+        </w:tblPrEx>
         <w:trPr>
           <w:cantSplit/>
-          <w:trHeight w:val="450"/>
+          <w:trHeight w:val="450" w:hRule="atLeast"/>
         </w:trPr>
         <w:tc>
           <w:tcPr>
             <w:tcW w:w="10391" w:type="dxa"/>
             <w:gridSpan w:val="2"/>
             <w:tcBorders>
-              <w:left w:val="single" w:sz="4" w:space="0" w:color="000000"/>
-              <w:bottom w:val="single" w:sz="4" w:space="0" w:color="000000"/>
-              <w:right w:val="single" w:sz="4" w:space="0" w:color="000000"/>
-            </w:tcBorders>
-            <w:shd w:val="clear" w:color="auto" w:fill="auto"/>
-          </w:tcPr>
-          <w:p>
-            <w:pPr>
-              <w:pStyle w:val="Ttulo2"/>
+              <w:left w:val="single" w:color="000000" w:sz="4" w:space="0"/>
+              <w:bottom w:val="single" w:color="000000" w:sz="4" w:space="0"/>
+              <w:right w:val="single" w:color="000000" w:sz="4" w:space="0"/>
+            </w:tcBorders>
+            <w:shd w:val="clear" w:color="auto" w:fill="auto"/>
+          </w:tcPr>
+          <w:p>
+            <w:pPr>
+              <w:pStyle w:val="3"/>
               <w:ind w:left="-141"/>
               <w:rPr>
                 <w:b/>
@@ -718,18 +778,26 @@
         </w:tc>
       </w:tr>
       <w:tr>
+        <w:tblPrEx>
+          <w:tblCellMar>
+            <w:top w:w="0" w:type="dxa"/>
+            <w:left w:w="70" w:type="dxa"/>
+            <w:bottom w:w="0" w:type="dxa"/>
+            <w:right w:w="70" w:type="dxa"/>
+          </w:tblCellMar>
+        </w:tblPrEx>
         <w:trPr>
           <w:cantSplit/>
-          <w:trHeight w:val="245"/>
+          <w:trHeight w:val="245" w:hRule="atLeast"/>
         </w:trPr>
         <w:tc>
           <w:tcPr>
             <w:tcW w:w="10391" w:type="dxa"/>
             <w:gridSpan w:val="2"/>
             <w:tcBorders>
-              <w:left w:val="single" w:sz="4" w:space="0" w:color="000000"/>
-              <w:bottom w:val="single" w:sz="4" w:space="0" w:color="000000"/>
-              <w:right w:val="single" w:sz="4" w:space="0" w:color="000000"/>
+              <w:left w:val="single" w:color="000000" w:sz="4" w:space="0"/>
+              <w:bottom w:val="single" w:color="000000" w:sz="4" w:space="0"/>
+              <w:right w:val="single" w:color="000000" w:sz="4" w:space="0"/>
             </w:tcBorders>
             <w:shd w:val="clear" w:color="auto" w:fill="auto"/>
           </w:tcPr>
@@ -804,11 +872,16 @@
     </w:p>
     <w:tbl>
       <w:tblPr>
-        <w:tblStyle w:val="a3"/>
+        <w:tblStyle w:val="34"/>
         <w:tblW w:w="10548" w:type="dxa"/>
         <w:tblInd w:w="-108" w:type="dxa"/>
         <w:tblLayout w:type="fixed"/>
-        <w:tblLook w:val="0000" w:firstRow="0" w:lastRow="0" w:firstColumn="0" w:lastColumn="0" w:noHBand="0" w:noVBand="0"/>
+        <w:tblCellMar>
+          <w:top w:w="0" w:type="dxa"/>
+          <w:left w:w="108" w:type="dxa"/>
+          <w:bottom w:w="0" w:type="dxa"/>
+          <w:right w:w="108" w:type="dxa"/>
+        </w:tblCellMar>
       </w:tblPr>
       <w:tblGrid>
         <w:gridCol w:w="2628"/>
@@ -816,15 +889,23 @@
         <w:gridCol w:w="6120"/>
       </w:tblGrid>
       <w:tr>
+        <w:tblPrEx>
+          <w:tblCellMar>
+            <w:top w:w="0" w:type="dxa"/>
+            <w:left w:w="108" w:type="dxa"/>
+            <w:bottom w:w="0" w:type="dxa"/>
+            <w:right w:w="108" w:type="dxa"/>
+          </w:tblCellMar>
+        </w:tblPrEx>
         <w:tc>
           <w:tcPr>
             <w:tcW w:w="10548" w:type="dxa"/>
             <w:gridSpan w:val="3"/>
             <w:tcBorders>
-              <w:top w:val="single" w:sz="4" w:space="0" w:color="000000"/>
-              <w:left w:val="single" w:sz="4" w:space="0" w:color="000000"/>
-              <w:bottom w:val="single" w:sz="4" w:space="0" w:color="000000"/>
-              <w:right w:val="single" w:sz="4" w:space="0" w:color="000000"/>
+              <w:top w:val="single" w:color="000000" w:sz="4" w:space="0"/>
+              <w:left w:val="single" w:color="000000" w:sz="4" w:space="0"/>
+              <w:bottom w:val="single" w:color="000000" w:sz="4" w:space="0"/>
+              <w:right w:val="single" w:color="000000" w:sz="4" w:space="0"/>
             </w:tcBorders>
             <w:shd w:val="clear" w:color="auto" w:fill="auto"/>
           </w:tcPr>
@@ -844,14 +925,22 @@
         </w:tc>
       </w:tr>
       <w:tr>
+        <w:tblPrEx>
+          <w:tblCellMar>
+            <w:top w:w="0" w:type="dxa"/>
+            <w:left w:w="108" w:type="dxa"/>
+            <w:bottom w:w="0" w:type="dxa"/>
+            <w:right w:w="108" w:type="dxa"/>
+          </w:tblCellMar>
+        </w:tblPrEx>
         <w:tc>
           <w:tcPr>
             <w:tcW w:w="2628" w:type="dxa"/>
             <w:tcBorders>
-              <w:top w:val="single" w:sz="4" w:space="0" w:color="000000"/>
-              <w:left w:val="single" w:sz="4" w:space="0" w:color="000000"/>
-              <w:bottom w:val="single" w:sz="4" w:space="0" w:color="000000"/>
-              <w:right w:val="single" w:sz="4" w:space="0" w:color="000000"/>
+              <w:top w:val="single" w:color="000000" w:sz="4" w:space="0"/>
+              <w:left w:val="single" w:color="000000" w:sz="4" w:space="0"/>
+              <w:bottom w:val="single" w:color="000000" w:sz="4" w:space="0"/>
+              <w:right w:val="single" w:color="000000" w:sz="4" w:space="0"/>
             </w:tcBorders>
             <w:shd w:val="clear" w:color="auto" w:fill="auto"/>
           </w:tcPr>
@@ -868,10 +957,10 @@
           <w:tcPr>
             <w:tcW w:w="1800" w:type="dxa"/>
             <w:tcBorders>
-              <w:top w:val="single" w:sz="4" w:space="0" w:color="000000"/>
-              <w:left w:val="single" w:sz="4" w:space="0" w:color="000000"/>
-              <w:bottom w:val="single" w:sz="4" w:space="0" w:color="000000"/>
-              <w:right w:val="single" w:sz="4" w:space="0" w:color="000000"/>
+              <w:top w:val="single" w:color="000000" w:sz="4" w:space="0"/>
+              <w:left w:val="single" w:color="000000" w:sz="4" w:space="0"/>
+              <w:bottom w:val="single" w:color="000000" w:sz="4" w:space="0"/>
+              <w:right w:val="single" w:color="000000" w:sz="4" w:space="0"/>
             </w:tcBorders>
             <w:shd w:val="clear" w:color="auto" w:fill="auto"/>
           </w:tcPr>
@@ -888,10 +977,10 @@
           <w:tcPr>
             <w:tcW w:w="6120" w:type="dxa"/>
             <w:tcBorders>
-              <w:top w:val="single" w:sz="4" w:space="0" w:color="000000"/>
-              <w:left w:val="single" w:sz="4" w:space="0" w:color="000000"/>
-              <w:bottom w:val="single" w:sz="4" w:space="0" w:color="000000"/>
-              <w:right w:val="single" w:sz="4" w:space="0" w:color="000000"/>
+              <w:top w:val="single" w:color="000000" w:sz="4" w:space="0"/>
+              <w:left w:val="single" w:color="000000" w:sz="4" w:space="0"/>
+              <w:bottom w:val="single" w:color="000000" w:sz="4" w:space="0"/>
+              <w:right w:val="single" w:color="000000" w:sz="4" w:space="0"/>
             </w:tcBorders>
             <w:shd w:val="clear" w:color="auto" w:fill="auto"/>
           </w:tcPr>
@@ -906,14 +995,22 @@
         </w:tc>
       </w:tr>
       <w:tr>
+        <w:tblPrEx>
+          <w:tblCellMar>
+            <w:top w:w="0" w:type="dxa"/>
+            <w:left w:w="108" w:type="dxa"/>
+            <w:bottom w:w="0" w:type="dxa"/>
+            <w:right w:w="108" w:type="dxa"/>
+          </w:tblCellMar>
+        </w:tblPrEx>
         <w:tc>
           <w:tcPr>
             <w:tcW w:w="2628" w:type="dxa"/>
             <w:tcBorders>
-              <w:top w:val="single" w:sz="4" w:space="0" w:color="000000"/>
-              <w:left w:val="single" w:sz="4" w:space="0" w:color="000000"/>
-              <w:bottom w:val="single" w:sz="4" w:space="0" w:color="000000"/>
-              <w:right w:val="single" w:sz="4" w:space="0" w:color="000000"/>
+              <w:top w:val="single" w:color="000000" w:sz="4" w:space="0"/>
+              <w:left w:val="single" w:color="000000" w:sz="4" w:space="0"/>
+              <w:bottom w:val="single" w:color="000000" w:sz="4" w:space="0"/>
+              <w:right w:val="single" w:color="000000" w:sz="4" w:space="0"/>
             </w:tcBorders>
             <w:shd w:val="clear" w:color="auto" w:fill="auto"/>
           </w:tcPr>
@@ -930,10 +1027,10 @@
           <w:tcPr>
             <w:tcW w:w="1800" w:type="dxa"/>
             <w:tcBorders>
-              <w:top w:val="single" w:sz="4" w:space="0" w:color="000000"/>
-              <w:left w:val="single" w:sz="4" w:space="0" w:color="000000"/>
-              <w:bottom w:val="single" w:sz="4" w:space="0" w:color="000000"/>
-              <w:right w:val="single" w:sz="4" w:space="0" w:color="000000"/>
+              <w:top w:val="single" w:color="000000" w:sz="4" w:space="0"/>
+              <w:left w:val="single" w:color="000000" w:sz="4" w:space="0"/>
+              <w:bottom w:val="single" w:color="000000" w:sz="4" w:space="0"/>
+              <w:right w:val="single" w:color="000000" w:sz="4" w:space="0"/>
             </w:tcBorders>
             <w:shd w:val="clear" w:color="auto" w:fill="auto"/>
           </w:tcPr>
@@ -950,10 +1047,10 @@
           <w:tcPr>
             <w:tcW w:w="6120" w:type="dxa"/>
             <w:tcBorders>
-              <w:top w:val="single" w:sz="4" w:space="0" w:color="000000"/>
-              <w:left w:val="single" w:sz="4" w:space="0" w:color="000000"/>
-              <w:bottom w:val="single" w:sz="4" w:space="0" w:color="000000"/>
-              <w:right w:val="single" w:sz="4" w:space="0" w:color="000000"/>
+              <w:top w:val="single" w:color="000000" w:sz="4" w:space="0"/>
+              <w:left w:val="single" w:color="000000" w:sz="4" w:space="0"/>
+              <w:bottom w:val="single" w:color="000000" w:sz="4" w:space="0"/>
+              <w:right w:val="single" w:color="000000" w:sz="4" w:space="0"/>
             </w:tcBorders>
             <w:shd w:val="clear" w:color="auto" w:fill="auto"/>
           </w:tcPr>
@@ -968,14 +1065,22 @@
         </w:tc>
       </w:tr>
       <w:tr>
+        <w:tblPrEx>
+          <w:tblCellMar>
+            <w:top w:w="0" w:type="dxa"/>
+            <w:left w:w="108" w:type="dxa"/>
+            <w:bottom w:w="0" w:type="dxa"/>
+            <w:right w:w="108" w:type="dxa"/>
+          </w:tblCellMar>
+        </w:tblPrEx>
         <w:tc>
           <w:tcPr>
             <w:tcW w:w="2628" w:type="dxa"/>
             <w:tcBorders>
-              <w:top w:val="single" w:sz="4" w:space="0" w:color="000000"/>
-              <w:left w:val="single" w:sz="4" w:space="0" w:color="000000"/>
-              <w:bottom w:val="single" w:sz="4" w:space="0" w:color="000000"/>
-              <w:right w:val="single" w:sz="4" w:space="0" w:color="000000"/>
+              <w:top w:val="single" w:color="000000" w:sz="4" w:space="0"/>
+              <w:left w:val="single" w:color="000000" w:sz="4" w:space="0"/>
+              <w:bottom w:val="single" w:color="000000" w:sz="4" w:space="0"/>
+              <w:right w:val="single" w:color="000000" w:sz="4" w:space="0"/>
             </w:tcBorders>
             <w:shd w:val="clear" w:color="auto" w:fill="auto"/>
           </w:tcPr>
@@ -992,10 +1097,10 @@
           <w:tcPr>
             <w:tcW w:w="1800" w:type="dxa"/>
             <w:tcBorders>
-              <w:top w:val="single" w:sz="4" w:space="0" w:color="000000"/>
-              <w:left w:val="single" w:sz="4" w:space="0" w:color="000000"/>
-              <w:bottom w:val="single" w:sz="4" w:space="0" w:color="000000"/>
-              <w:right w:val="single" w:sz="4" w:space="0" w:color="000000"/>
+              <w:top w:val="single" w:color="000000" w:sz="4" w:space="0"/>
+              <w:left w:val="single" w:color="000000" w:sz="4" w:space="0"/>
+              <w:bottom w:val="single" w:color="000000" w:sz="4" w:space="0"/>
+              <w:right w:val="single" w:color="000000" w:sz="4" w:space="0"/>
             </w:tcBorders>
             <w:shd w:val="clear" w:color="auto" w:fill="auto"/>
           </w:tcPr>
@@ -1012,10 +1117,10 @@
           <w:tcPr>
             <w:tcW w:w="6120" w:type="dxa"/>
             <w:tcBorders>
-              <w:top w:val="single" w:sz="4" w:space="0" w:color="000000"/>
-              <w:left w:val="single" w:sz="4" w:space="0" w:color="000000"/>
-              <w:bottom w:val="single" w:sz="4" w:space="0" w:color="000000"/>
-              <w:right w:val="single" w:sz="4" w:space="0" w:color="000000"/>
+              <w:top w:val="single" w:color="000000" w:sz="4" w:space="0"/>
+              <w:left w:val="single" w:color="000000" w:sz="4" w:space="0"/>
+              <w:bottom w:val="single" w:color="000000" w:sz="4" w:space="0"/>
+              <w:right w:val="single" w:color="000000" w:sz="4" w:space="0"/>
             </w:tcBorders>
             <w:shd w:val="clear" w:color="auto" w:fill="auto"/>
           </w:tcPr>
@@ -1030,14 +1135,22 @@
         </w:tc>
       </w:tr>
       <w:tr>
+        <w:tblPrEx>
+          <w:tblCellMar>
+            <w:top w:w="0" w:type="dxa"/>
+            <w:left w:w="108" w:type="dxa"/>
+            <w:bottom w:w="0" w:type="dxa"/>
+            <w:right w:w="108" w:type="dxa"/>
+          </w:tblCellMar>
+        </w:tblPrEx>
         <w:tc>
           <w:tcPr>
             <w:tcW w:w="2628" w:type="dxa"/>
             <w:tcBorders>
-              <w:top w:val="single" w:sz="4" w:space="0" w:color="000000"/>
-              <w:left w:val="single" w:sz="4" w:space="0" w:color="000000"/>
-              <w:bottom w:val="single" w:sz="4" w:space="0" w:color="000000"/>
-              <w:right w:val="single" w:sz="4" w:space="0" w:color="000000"/>
+              <w:top w:val="single" w:color="000000" w:sz="4" w:space="0"/>
+              <w:left w:val="single" w:color="000000" w:sz="4" w:space="0"/>
+              <w:bottom w:val="single" w:color="000000" w:sz="4" w:space="0"/>
+              <w:right w:val="single" w:color="000000" w:sz="4" w:space="0"/>
             </w:tcBorders>
             <w:shd w:val="clear" w:color="auto" w:fill="auto"/>
           </w:tcPr>
@@ -1054,10 +1167,10 @@
           <w:tcPr>
             <w:tcW w:w="1800" w:type="dxa"/>
             <w:tcBorders>
-              <w:top w:val="single" w:sz="4" w:space="0" w:color="000000"/>
-              <w:left w:val="single" w:sz="4" w:space="0" w:color="000000"/>
-              <w:bottom w:val="single" w:sz="4" w:space="0" w:color="000000"/>
-              <w:right w:val="single" w:sz="4" w:space="0" w:color="000000"/>
+              <w:top w:val="single" w:color="000000" w:sz="4" w:space="0"/>
+              <w:left w:val="single" w:color="000000" w:sz="4" w:space="0"/>
+              <w:bottom w:val="single" w:color="000000" w:sz="4" w:space="0"/>
+              <w:right w:val="single" w:color="000000" w:sz="4" w:space="0"/>
             </w:tcBorders>
             <w:shd w:val="clear" w:color="auto" w:fill="auto"/>
           </w:tcPr>
@@ -1074,10 +1187,10 @@
           <w:tcPr>
             <w:tcW w:w="6120" w:type="dxa"/>
             <w:tcBorders>
-              <w:top w:val="single" w:sz="4" w:space="0" w:color="000000"/>
-              <w:left w:val="single" w:sz="4" w:space="0" w:color="000000"/>
-              <w:bottom w:val="single" w:sz="4" w:space="0" w:color="000000"/>
-              <w:right w:val="single" w:sz="4" w:space="0" w:color="000000"/>
+              <w:top w:val="single" w:color="000000" w:sz="4" w:space="0"/>
+              <w:left w:val="single" w:color="000000" w:sz="4" w:space="0"/>
+              <w:bottom w:val="single" w:color="000000" w:sz="4" w:space="0"/>
+              <w:right w:val="single" w:color="000000" w:sz="4" w:space="0"/>
             </w:tcBorders>
             <w:shd w:val="clear" w:color="auto" w:fill="auto"/>
           </w:tcPr>
@@ -1088,11 +1201,125 @@
             <w:r>
               <w:t>Criação do Fluxo de Exceção</w:t>
             </w:r>
-            <w:bookmarkStart w:id="0" w:name="_GoBack"/>
-            <w:bookmarkEnd w:id="0"/>
           </w:p>
         </w:tc>
       </w:tr>
+      <w:tr>
+        <w:tblPrEx>
+          <w:tblCellMar>
+            <w:top w:w="0" w:type="dxa"/>
+            <w:left w:w="108" w:type="dxa"/>
+            <w:bottom w:w="0" w:type="dxa"/>
+            <w:right w:w="108" w:type="dxa"/>
+          </w:tblCellMar>
+        </w:tblPrEx>
+        <w:tc>
+          <w:tcPr>
+            <w:tcW w:w="2628" w:type="dxa"/>
+            <w:tcBorders>
+              <w:top w:val="single" w:color="000000" w:sz="4" w:space="0"/>
+              <w:left w:val="single" w:color="000000" w:sz="4" w:space="0"/>
+              <w:bottom w:val="single" w:color="000000" w:sz="4" w:space="0"/>
+              <w:right w:val="single" w:color="000000" w:sz="4" w:space="0"/>
+            </w:tcBorders>
+            <w:shd w:val="clear" w:color="auto" w:fill="auto"/>
+          </w:tcPr>
+          <w:p>
+            <w:pPr>
+              <w:jc w:val="center"/>
+              <w:rPr>
+                <w:rFonts w:hint="default"/>
+                <w:lang w:val="pt-BR"/>
+              </w:rPr>
+            </w:pPr>
+            <w:bookmarkStart w:id="0" w:name="_GoBack" w:colFirst="0" w:colLast="0"/>
+            <w:r>
+              <w:rPr>
+                <w:rFonts w:hint="default"/>
+                <w:lang w:val="pt-BR"/>
+              </w:rPr>
+              <w:t>07</w:t>
+            </w:r>
+            <w:r>
+              <w:t>/</w:t>
+            </w:r>
+            <w:r>
+              <w:rPr>
+                <w:rFonts w:hint="default"/>
+                <w:lang w:val="pt-BR"/>
+              </w:rPr>
+              <w:t>11</w:t>
+            </w:r>
+            <w:r>
+              <w:t>/</w:t>
+            </w:r>
+            <w:r>
+              <w:rPr>
+                <w:rFonts w:hint="default"/>
+                <w:lang w:val="pt-BR"/>
+              </w:rPr>
+              <w:t>2025</w:t>
+            </w:r>
+          </w:p>
+        </w:tc>
+        <w:tc>
+          <w:tcPr>
+            <w:tcW w:w="1800" w:type="dxa"/>
+            <w:tcBorders>
+              <w:top w:val="single" w:color="000000" w:sz="4" w:space="0"/>
+              <w:left w:val="single" w:color="000000" w:sz="4" w:space="0"/>
+              <w:bottom w:val="single" w:color="000000" w:sz="4" w:space="0"/>
+              <w:right w:val="single" w:color="000000" w:sz="4" w:space="0"/>
+            </w:tcBorders>
+            <w:shd w:val="clear" w:color="auto" w:fill="auto"/>
+          </w:tcPr>
+          <w:p>
+            <w:pPr>
+              <w:jc w:val="center"/>
+              <w:rPr>
+                <w:rFonts w:hint="default"/>
+                <w:lang w:val="pt-BR"/>
+              </w:rPr>
+            </w:pPr>
+            <w:r>
+              <w:rPr>
+                <w:rFonts w:hint="default"/>
+                <w:lang w:val="pt-BR"/>
+              </w:rPr>
+              <w:t>Kauan Felipe</w:t>
+            </w:r>
+          </w:p>
+        </w:tc>
+        <w:tc>
+          <w:tcPr>
+            <w:tcW w:w="6120" w:type="dxa"/>
+            <w:tcBorders>
+              <w:top w:val="single" w:color="000000" w:sz="4" w:space="0"/>
+              <w:left w:val="single" w:color="000000" w:sz="4" w:space="0"/>
+              <w:bottom w:val="single" w:color="000000" w:sz="4" w:space="0"/>
+              <w:right w:val="single" w:color="000000" w:sz="4" w:space="0"/>
+            </w:tcBorders>
+            <w:shd w:val="clear" w:color="auto" w:fill="auto"/>
+          </w:tcPr>
+          <w:p>
+            <w:pPr>
+              <w:jc w:val="center"/>
+              <w:rPr>
+                <w:rFonts w:hint="default"/>
+                <w:lang w:val="pt-BR"/>
+              </w:rPr>
+            </w:pPr>
+            <w:r>
+              <w:rPr>
+                <w:rFonts w:hint="default"/>
+                <w:lang w:val="pt-BR"/>
+              </w:rPr>
+              <w:t>Correção dos nomes das telas</w:t>
+            </w:r>
+          </w:p>
+        </w:tc>
+      </w:tr>
+      <w:bookmarkEnd w:id="0"/>
     </w:tbl>
     <w:p>
       <w:pPr>
@@ -1103,19 +1330,19 @@
       <w:pgSz w:w="11906" w:h="16838"/>
       <w:pgMar w:top="1418" w:right="851" w:bottom="1418" w:left="851" w:header="720" w:footer="720" w:gutter="0"/>
       <w:pgNumType w:start="1"/>
-      <w:cols w:space="720"/>
+      <w:cols w:space="720" w:num="1"/>
     </w:sectPr>
   </w:body>
 </w:document>
 </file>
 
 <file path=word/numbering.xml><?xml version="1.0" encoding="utf-8"?>
-<w:numbering xmlns:wpc="http://schemas.microsoft.com/office/word/2010/wordprocessingCanvas" xmlns:cx="http://schemas.microsoft.com/office/drawing/2014/chartex" xmlns:cx1="http://schemas.microsoft.com/office/drawing/2015/9/8/chartex" xmlns:cx2="http://schemas.microsoft.com/office/drawing/2015/10/21/chartex" xmlns:cx3="http://schemas.microsoft.com/office/drawing/2016/5/9/chartex" xmlns:cx4="http://schemas.microsoft.com/office/drawing/2016/5/10/chartex" xmlns:cx5="http://schemas.microsoft.com/office/drawing/2016/5/11/chartex" xmlns:cx6="http://schemas.microsoft.com/office/drawing/2016/5/12/chartex" xmlns:cx7="http://schemas.microsoft.com/office/drawing/2016/5/13/chartex" xmlns:cx8="http://schemas.microsoft.com/office/drawing/2016/5/14/chartex" xmlns:mc="http://schemas.openxmlformats.org/markup-compatibility/2006" xmlns:aink="http://schemas.microsoft.com/office/drawing/2016/ink" xmlns:am3d="http://schemas.microsoft.com/office/drawing/2017/model3d" xmlns:o="urn:schemas-microsoft-com:office:office" xmlns:r="http://schemas.openxmlformats.org/officeDocument/2006/relationships" xmlns:m="http://schemas.openxmlformats.org/officeDocument/2006/math" xmlns:v="urn:schemas-microsoft-com:vml" xmlns:wp14="http://schemas.microsoft.com/office/word/2010/wordprocessingDrawing" xmlns:wp="http://schemas.openxmlformats.org/drawingml/2006/wordprocessingDrawing" xmlns:w10="urn:schemas-microsoft-com:office:word" xmlns:w="http://schemas.openxmlformats.org/wordprocessingml/2006/main" xmlns:w14="http://schemas.microsoft.com/office/word/2010/wordml" xmlns:w15="http://schemas.microsoft.com/office/word/2012/wordml" xmlns:w16cex="http://schemas.microsoft.com/office/word/2018/wordml/cex" xmlns:w16cid="http://schemas.microsoft.com/office/word/2016/wordml/cid" xmlns:w16="http://schemas.microsoft.com/office/word/2018/wordml" xmlns:w16se="http://schemas.microsoft.com/office/word/2015/wordml/symex" xmlns:wpg="http://schemas.microsoft.com/office/word/2010/wordprocessingGroup" xmlns:wpi="http://schemas.microsoft.com/office/word/2010/wordprocessingInk" xmlns:wne="http://schemas.microsoft.com/office/word/2006/wordml" xmlns:wps="http://schemas.microsoft.com/office/word/2010/wordprocessingShape" mc:Ignorable="w14 w15 w16se w16cid w16 w16cex wp14">
-  <w:abstractNum w:abstractNumId="0" w15:restartNumberingAfterBreak="0">
+<w:numbering xmlns:wpc="http://schemas.microsoft.com/office/word/2010/wordprocessingCanvas" xmlns:mc="http://schemas.openxmlformats.org/markup-compatibility/2006" xmlns:o="urn:schemas-microsoft-com:office:office" xmlns:r="http://schemas.openxmlformats.org/officeDocument/2006/relationships" xmlns:m="http://schemas.openxmlformats.org/officeDocument/2006/math" xmlns:v="urn:schemas-microsoft-com:vml" xmlns:wp14="http://schemas.microsoft.com/office/word/2010/wordprocessingDrawing" xmlns:wp="http://schemas.openxmlformats.org/drawingml/2006/wordprocessingDrawing" xmlns:w10="urn:schemas-microsoft-com:office:word" xmlns:w="http://schemas.openxmlformats.org/wordprocessingml/2006/main" xmlns:w14="http://schemas.microsoft.com/office/word/2010/wordml" xmlns:wpg="http://schemas.microsoft.com/office/word/2010/wordprocessingGroup" xmlns:wpi="http://schemas.microsoft.com/office/word/2010/wordprocessingInk" xmlns:wne="http://schemas.microsoft.com/office/word/2006/wordml" xmlns:wps="http://schemas.microsoft.com/office/word/2010/wordprocessingShape" xmlns:wpsCustomData="http://www.wps.cn/officeDocument/2013/wpsCustomData" mc:Ignorable="w14 wp14">
+  <w:abstractNum w:abstractNumId="0">
     <w:nsid w:val="42DC308C"/>
     <w:multiLevelType w:val="multilevel"/>
-    <w:tmpl w:val="30126E5A"/>
-    <w:lvl w:ilvl="0">
+    <w:tmpl w:val="42DC308C"/>
+    <w:lvl w:ilvl="0" w:tentative="0">
       <w:start w:val="1"/>
       <w:numFmt w:val="decimal"/>
       <w:lvlText w:val=""/>
@@ -1127,7 +1354,7 @@
         <w:vertAlign w:val="baseline"/>
       </w:rPr>
     </w:lvl>
-    <w:lvl w:ilvl="1">
+    <w:lvl w:ilvl="1" w:tentative="0">
       <w:start w:val="1"/>
       <w:numFmt w:val="decimal"/>
       <w:lvlText w:val=""/>
@@ -1139,7 +1366,7 @@
         <w:vertAlign w:val="baseline"/>
       </w:rPr>
     </w:lvl>
-    <w:lvl w:ilvl="2">
+    <w:lvl w:ilvl="2" w:tentative="0">
       <w:start w:val="1"/>
       <w:numFmt w:val="decimal"/>
       <w:lvlText w:val=""/>
@@ -1151,7 +1378,7 @@
         <w:vertAlign w:val="baseline"/>
       </w:rPr>
     </w:lvl>
-    <w:lvl w:ilvl="3">
+    <w:lvl w:ilvl="3" w:tentative="0">
       <w:start w:val="1"/>
       <w:numFmt w:val="decimal"/>
       <w:lvlText w:val=""/>
@@ -1163,7 +1390,7 @@
         <w:vertAlign w:val="baseline"/>
       </w:rPr>
     </w:lvl>
-    <w:lvl w:ilvl="4">
+    <w:lvl w:ilvl="4" w:tentative="0">
       <w:start w:val="1"/>
       <w:numFmt w:val="decimal"/>
       <w:lvlText w:val=""/>
@@ -1175,7 +1402,7 @@
         <w:vertAlign w:val="baseline"/>
       </w:rPr>
     </w:lvl>
-    <w:lvl w:ilvl="5">
+    <w:lvl w:ilvl="5" w:tentative="0">
       <w:start w:val="1"/>
       <w:numFmt w:val="decimal"/>
       <w:lvlText w:val=""/>
@@ -1187,7 +1414,7 @@
         <w:vertAlign w:val="baseline"/>
       </w:rPr>
     </w:lvl>
-    <w:lvl w:ilvl="6">
+    <w:lvl w:ilvl="6" w:tentative="0">
       <w:start w:val="1"/>
       <w:numFmt w:val="decimal"/>
       <w:lvlText w:val=""/>
@@ -1199,7 +1426,7 @@
         <w:vertAlign w:val="baseline"/>
       </w:rPr>
     </w:lvl>
-    <w:lvl w:ilvl="7">
+    <w:lvl w:ilvl="7" w:tentative="0">
       <w:start w:val="1"/>
       <w:numFmt w:val="decimal"/>
       <w:lvlText w:val=""/>
@@ -1211,7 +1438,7 @@
         <w:vertAlign w:val="baseline"/>
       </w:rPr>
     </w:lvl>
-    <w:lvl w:ilvl="8">
+    <w:lvl w:ilvl="8" w:tentative="0">
       <w:start w:val="1"/>
       <w:numFmt w:val="decimal"/>
       <w:lvlText w:val=""/>
@@ -1231,406 +1458,184 @@
 </file>
 
 <file path=word/styles.xml><?xml version="1.0" encoding="utf-8"?>
-<w:styles xmlns:mc="http://schemas.openxmlformats.org/markup-compatibility/2006" xmlns:r="http://schemas.openxmlformats.org/officeDocument/2006/relationships" xmlns:w="http://schemas.openxmlformats.org/wordprocessingml/2006/main" xmlns:w14="http://schemas.microsoft.com/office/word/2010/wordml" xmlns:w15="http://schemas.microsoft.com/office/word/2012/wordml" xmlns:w16cex="http://schemas.microsoft.com/office/word/2018/wordml/cex" xmlns:w16cid="http://schemas.microsoft.com/office/word/2016/wordml/cid" xmlns:w16="http://schemas.microsoft.com/office/word/2018/wordml" xmlns:w16se="http://schemas.microsoft.com/office/word/2015/wordml/symex" mc:Ignorable="w14 w15 w16se w16cid w16 w16cex">
+<w:styles xmlns:mc="http://schemas.openxmlformats.org/markup-compatibility/2006" xmlns:o="urn:schemas-microsoft-com:office:office" xmlns:r="http://schemas.openxmlformats.org/officeDocument/2006/relationships" xmlns:m="http://schemas.openxmlformats.org/officeDocument/2006/math" xmlns:v="urn:schemas-microsoft-com:vml" xmlns:w="http://schemas.openxmlformats.org/wordprocessingml/2006/main" xmlns:w14="http://schemas.microsoft.com/office/word/2010/wordml" xmlns:w10="urn:schemas-microsoft-com:office:word" xmlns:sl="http://schemas.openxmlformats.org/schemaLibrary/2006/main" xmlns:wpsCustomData="http://www.wps.cn/officeDocument/2013/wpsCustomData" mc:Ignorable="w14">
   <w:docDefaults>
     <w:rPrDefault>
       <w:rPr>
-        <w:rFonts w:ascii="Times New Roman" w:eastAsia="Times New Roman" w:hAnsi="Times New Roman" w:cs="Times New Roman"/>
-        <w:sz w:val="24"/>
-        <w:szCs w:val="24"/>
-        <w:lang w:val="pt-BR" w:eastAsia="pt-BR" w:bidi="ar-SA"/>
+        <w:rFonts w:ascii="Times New Roman" w:hAnsi="Times New Roman" w:eastAsia="Times New Roman" w:cs="Times New Roman"/>
       </w:rPr>
     </w:rPrDefault>
     <w:pPrDefault/>
   </w:docDefaults>
-  <w:latentStyles w:defLockedState="0" w:defUIPriority="99" w:defSemiHidden="0" w:defUnhideWhenUsed="0" w:defQFormat="0" w:count="376">
-    <w:lsdException w:name="Normal" w:uiPriority="0" w:qFormat="1"/>
-    <w:lsdException w:name="heading 1" w:uiPriority="9" w:qFormat="1"/>
-    <w:lsdException w:name="heading 2" w:semiHidden="1" w:uiPriority="9" w:unhideWhenUsed="1" w:qFormat="1"/>
-    <w:lsdException w:name="heading 3" w:semiHidden="1" w:uiPriority="9" w:unhideWhenUsed="1" w:qFormat="1"/>
-    <w:lsdException w:name="heading 4" w:semiHidden="1" w:uiPriority="9" w:unhideWhenUsed="1" w:qFormat="1"/>
-    <w:lsdException w:name="heading 5" w:semiHidden="1" w:uiPriority="9" w:unhideWhenUsed="1" w:qFormat="1"/>
-    <w:lsdException w:name="heading 6" w:semiHidden="1" w:uiPriority="9" w:unhideWhenUsed="1" w:qFormat="1"/>
-    <w:lsdException w:name="heading 7" w:semiHidden="1" w:uiPriority="9" w:unhideWhenUsed="1" w:qFormat="1"/>
-    <w:lsdException w:name="heading 8" w:semiHidden="1" w:uiPriority="9" w:unhideWhenUsed="1" w:qFormat="1"/>
-    <w:lsdException w:name="heading 9" w:semiHidden="1" w:uiPriority="9" w:unhideWhenUsed="1" w:qFormat="1"/>
-    <w:lsdException w:name="index 1" w:semiHidden="1" w:unhideWhenUsed="1"/>
-    <w:lsdException w:name="index 2" w:semiHidden="1" w:unhideWhenUsed="1"/>
-    <w:lsdException w:name="index 3" w:semiHidden="1" w:unhideWhenUsed="1"/>
-    <w:lsdException w:name="index 4" w:semiHidden="1" w:unhideWhenUsed="1"/>
-    <w:lsdException w:name="index 5" w:semiHidden="1" w:unhideWhenUsed="1"/>
-    <w:lsdException w:name="index 6" w:semiHidden="1" w:unhideWhenUsed="1"/>
-    <w:lsdException w:name="index 7" w:semiHidden="1" w:unhideWhenUsed="1"/>
-    <w:lsdException w:name="index 8" w:semiHidden="1" w:unhideWhenUsed="1"/>
-    <w:lsdException w:name="index 9" w:semiHidden="1" w:unhideWhenUsed="1"/>
-    <w:lsdException w:name="toc 1" w:semiHidden="1" w:uiPriority="39" w:unhideWhenUsed="1"/>
-    <w:lsdException w:name="toc 2" w:semiHidden="1" w:uiPriority="39" w:unhideWhenUsed="1"/>
-    <w:lsdException w:name="toc 3" w:semiHidden="1" w:uiPriority="39" w:unhideWhenUsed="1"/>
-    <w:lsdException w:name="toc 4" w:semiHidden="1" w:uiPriority="39" w:unhideWhenUsed="1"/>
-    <w:lsdException w:name="toc 5" w:semiHidden="1" w:uiPriority="39" w:unhideWhenUsed="1"/>
-    <w:lsdException w:name="toc 6" w:semiHidden="1" w:uiPriority="39" w:unhideWhenUsed="1"/>
-    <w:lsdException w:name="toc 7" w:semiHidden="1" w:uiPriority="39" w:unhideWhenUsed="1"/>
-    <w:lsdException w:name="toc 8" w:semiHidden="1" w:uiPriority="39" w:unhideWhenUsed="1"/>
-    <w:lsdException w:name="toc 9" w:semiHidden="1" w:uiPriority="39" w:unhideWhenUsed="1"/>
-    <w:lsdException w:name="Normal Indent" w:semiHidden="1" w:unhideWhenUsed="1"/>
-    <w:lsdException w:name="footnote text" w:semiHidden="1" w:unhideWhenUsed="1"/>
-    <w:lsdException w:name="annotation text" w:semiHidden="1" w:unhideWhenUsed="1"/>
-    <w:lsdException w:name="header" w:semiHidden="1" w:unhideWhenUsed="1"/>
-    <w:lsdException w:name="footer" w:semiHidden="1" w:unhideWhenUsed="1"/>
-    <w:lsdException w:name="index heading" w:semiHidden="1" w:unhideWhenUsed="1"/>
-    <w:lsdException w:name="caption" w:semiHidden="1" w:uiPriority="35" w:unhideWhenUsed="1" w:qFormat="1"/>
-    <w:lsdException w:name="table of figures" w:semiHidden="1" w:unhideWhenUsed="1"/>
-    <w:lsdException w:name="envelope address" w:semiHidden="1" w:unhideWhenUsed="1"/>
-    <w:lsdException w:name="envelope return" w:semiHidden="1" w:unhideWhenUsed="1"/>
-    <w:lsdException w:name="footnote reference" w:semiHidden="1" w:unhideWhenUsed="1"/>
-    <w:lsdException w:name="annotation reference" w:semiHidden="1" w:unhideWhenUsed="1"/>
-    <w:lsdException w:name="line number" w:semiHidden="1" w:unhideWhenUsed="1"/>
-    <w:lsdException w:name="page number" w:semiHidden="1" w:unhideWhenUsed="1"/>
-    <w:lsdException w:name="endnote reference" w:semiHidden="1" w:unhideWhenUsed="1"/>
-    <w:lsdException w:name="endnote text" w:semiHidden="1" w:unhideWhenUsed="1"/>
-    <w:lsdException w:name="table of authorities" w:semiHidden="1" w:unhideWhenUsed="1"/>
-    <w:lsdException w:name="macro" w:semiHidden="1" w:unhideWhenUsed="1"/>
-    <w:lsdException w:name="toa heading" w:semiHidden="1" w:unhideWhenUsed="1"/>
-    <w:lsdException w:name="List" w:semiHidden="1" w:unhideWhenUsed="1"/>
-    <w:lsdException w:name="List Bullet" w:semiHidden="1" w:unhideWhenUsed="1"/>
-    <w:lsdException w:name="List Number" w:semiHidden="1" w:unhideWhenUsed="1"/>
-    <w:lsdException w:name="List 2" w:semiHidden="1" w:unhideWhenUsed="1"/>
-    <w:lsdException w:name="List 3" w:semiHidden="1" w:unhideWhenUsed="1"/>
-    <w:lsdException w:name="List 4" w:semiHidden="1" w:unhideWhenUsed="1"/>
-    <w:lsdException w:name="List 5" w:semiHidden="1" w:unhideWhenUsed="1"/>
-    <w:lsdException w:name="List Bullet 2" w:semiHidden="1" w:unhideWhenUsed="1"/>
-    <w:lsdException w:name="List Bullet 3" w:semiHidden="1" w:unhideWhenUsed="1"/>
-    <w:lsdException w:name="List Bullet 4" w:semiHidden="1" w:unhideWhenUsed="1"/>
-    <w:lsdException w:name="List Bullet 5" w:semiHidden="1" w:unhideWhenUsed="1"/>
-    <w:lsdException w:name="List Number 2" w:semiHidden="1" w:unhideWhenUsed="1"/>
-    <w:lsdException w:name="List Number 3" w:semiHidden="1" w:unhideWhenUsed="1"/>
-    <w:lsdException w:name="List Number 4" w:semiHidden="1" w:unhideWhenUsed="1"/>
-    <w:lsdException w:name="List Number 5" w:semiHidden="1" w:unhideWhenUsed="1"/>
-    <w:lsdException w:name="Title" w:uiPriority="10" w:qFormat="1"/>
-    <w:lsdException w:name="Closing" w:semiHidden="1" w:unhideWhenUsed="1"/>
-    <w:lsdException w:name="Signature" w:semiHidden="1" w:unhideWhenUsed="1"/>
-    <w:lsdException w:name="Default Paragraph Font" w:semiHidden="1" w:uiPriority="1" w:unhideWhenUsed="1"/>
-    <w:lsdException w:name="Body Text" w:semiHidden="1" w:unhideWhenUsed="1"/>
-    <w:lsdException w:name="Body Text Indent" w:semiHidden="1" w:unhideWhenUsed="1"/>
-    <w:lsdException w:name="List Continue" w:semiHidden="1" w:unhideWhenUsed="1"/>
-    <w:lsdException w:name="List Continue 2" w:semiHidden="1" w:unhideWhenUsed="1"/>
-    <w:lsdException w:name="List Continue 3" w:semiHidden="1" w:unhideWhenUsed="1"/>
-    <w:lsdException w:name="List Continue 4" w:semiHidden="1" w:unhideWhenUsed="1"/>
-    <w:lsdException w:name="List Continue 5" w:semiHidden="1" w:unhideWhenUsed="1"/>
-    <w:lsdException w:name="Message Header" w:semiHidden="1" w:unhideWhenUsed="1"/>
-    <w:lsdException w:name="Subtitle" w:uiPriority="11" w:qFormat="1"/>
-    <w:lsdException w:name="Salutation" w:semiHidden="1" w:unhideWhenUsed="1"/>
-    <w:lsdException w:name="Date" w:semiHidden="1" w:unhideWhenUsed="1"/>
-    <w:lsdException w:name="Body Text First Indent" w:semiHidden="1" w:unhideWhenUsed="1"/>
-    <w:lsdException w:name="Body Text First Indent 2" w:semiHidden="1" w:unhideWhenUsed="1"/>
-    <w:lsdException w:name="Note Heading" w:semiHidden="1" w:unhideWhenUsed="1"/>
-    <w:lsdException w:name="Body Text 2" w:semiHidden="1" w:unhideWhenUsed="1"/>
-    <w:lsdException w:name="Body Text 3" w:semiHidden="1" w:unhideWhenUsed="1"/>
-    <w:lsdException w:name="Body Text Indent 2" w:semiHidden="1" w:unhideWhenUsed="1"/>
-    <w:lsdException w:name="Body Text Indent 3" w:semiHidden="1" w:unhideWhenUsed="1"/>
-    <w:lsdException w:name="Block Text" w:semiHidden="1" w:unhideWhenUsed="1"/>
-    <w:lsdException w:name="Hyperlink" w:semiHidden="1" w:unhideWhenUsed="1"/>
-    <w:lsdException w:name="FollowedHyperlink" w:semiHidden="1" w:unhideWhenUsed="1"/>
-    <w:lsdException w:name="Strong" w:uiPriority="22" w:qFormat="1"/>
-    <w:lsdException w:name="Emphasis" w:uiPriority="20" w:qFormat="1"/>
-    <w:lsdException w:name="Document Map" w:semiHidden="1" w:unhideWhenUsed="1"/>
-    <w:lsdException w:name="Plain Text" w:semiHidden="1" w:unhideWhenUsed="1"/>
-    <w:lsdException w:name="E-mail Signature" w:semiHidden="1" w:unhideWhenUsed="1"/>
-    <w:lsdException w:name="HTML Top of Form" w:semiHidden="1" w:unhideWhenUsed="1"/>
-    <w:lsdException w:name="HTML Bottom of Form" w:semiHidden="1" w:unhideWhenUsed="1"/>
-    <w:lsdException w:name="Normal (Web)" w:semiHidden="1" w:unhideWhenUsed="1"/>
-    <w:lsdException w:name="HTML Acronym" w:semiHidden="1" w:unhideWhenUsed="1"/>
-    <w:lsdException w:name="HTML Address" w:semiHidden="1" w:unhideWhenUsed="1"/>
-    <w:lsdException w:name="HTML Cite" w:semiHidden="1" w:unhideWhenUsed="1"/>
-    <w:lsdException w:name="HTML Code" w:semiHidden="1" w:unhideWhenUsed="1"/>
-    <w:lsdException w:name="HTML Definition" w:semiHidden="1" w:unhideWhenUsed="1"/>
-    <w:lsdException w:name="HTML Keyboard" w:semiHidden="1" w:unhideWhenUsed="1"/>
-    <w:lsdException w:name="HTML Preformatted" w:semiHidden="1" w:unhideWhenUsed="1"/>
-    <w:lsdException w:name="HTML Sample" w:semiHidden="1" w:unhideWhenUsed="1"/>
-    <w:lsdException w:name="HTML Typewriter" w:semiHidden="1" w:unhideWhenUsed="1"/>
-    <w:lsdException w:name="HTML Variable" w:semiHidden="1" w:unhideWhenUsed="1"/>
-    <w:lsdException w:name="Normal Table" w:semiHidden="1" w:unhideWhenUsed="1"/>
-    <w:lsdException w:name="annotation subject" w:semiHidden="1" w:unhideWhenUsed="1"/>
-    <w:lsdException w:name="No List" w:semiHidden="1" w:unhideWhenUsed="1"/>
-    <w:lsdException w:name="Outline List 1" w:semiHidden="1" w:unhideWhenUsed="1"/>
-    <w:lsdException w:name="Outline List 2" w:semiHidden="1" w:unhideWhenUsed="1"/>
-    <w:lsdException w:name="Outline List 3" w:semiHidden="1" w:unhideWhenUsed="1"/>
-    <w:lsdException w:name="Table Simple 1" w:semiHidden="1" w:unhideWhenUsed="1"/>
-    <w:lsdException w:name="Table Simple 2" w:semiHidden="1" w:unhideWhenUsed="1"/>
-    <w:lsdException w:name="Table Simple 3" w:semiHidden="1" w:unhideWhenUsed="1"/>
-    <w:lsdException w:name="Table Classic 1" w:semiHidden="1" w:unhideWhenUsed="1"/>
-    <w:lsdException w:name="Table Classic 2" w:semiHidden="1" w:unhideWhenUsed="1"/>
-    <w:lsdException w:name="Table Classic 3" w:semiHidden="1" w:unhideWhenUsed="1"/>
-    <w:lsdException w:name="Table Classic 4" w:semiHidden="1" w:unhideWhenUsed="1"/>
-    <w:lsdException w:name="Table Colorful 1" w:semiHidden="1" w:unhideWhenUsed="1"/>
-    <w:lsdException w:name="Table Colorful 2" w:semiHidden="1" w:unhideWhenUsed="1"/>
-    <w:lsdException w:name="Table Colorful 3" w:semiHidden="1" w:unhideWhenUsed="1"/>
-    <w:lsdException w:name="Table Columns 1" w:semiHidden="1" w:unhideWhenUsed="1"/>
-    <w:lsdException w:name="Table Columns 2" w:semiHidden="1" w:unhideWhenUsed="1"/>
-    <w:lsdException w:name="Table Columns 3" w:semiHidden="1" w:unhideWhenUsed="1"/>
-    <w:lsdException w:name="Table Columns 4" w:semiHidden="1" w:unhideWhenUsed="1"/>
-    <w:lsdException w:name="Table Columns 5" w:semiHidden="1" w:unhideWhenUsed="1"/>
-    <w:lsdException w:name="Table Grid 1" w:semiHidden="1" w:unhideWhenUsed="1"/>
-    <w:lsdException w:name="Table Grid 2" w:semiHidden="1" w:unhideWhenUsed="1"/>
-    <w:lsdException w:name="Table Grid 3" w:semiHidden="1" w:unhideWhenUsed="1"/>
-    <w:lsdException w:name="Table Grid 4" w:semiHidden="1" w:unhideWhenUsed="1"/>
-    <w:lsdException w:name="Table Grid 5" w:semiHidden="1" w:unhideWhenUsed="1"/>
-    <w:lsdException w:name="Table Grid 6" w:semiHidden="1" w:unhideWhenUsed="1"/>
-    <w:lsdException w:name="Table Grid 7" w:semiHidden="1" w:unhideWhenUsed="1"/>
-    <w:lsdException w:name="Table Grid 8" w:semiHidden="1" w:unhideWhenUsed="1"/>
-    <w:lsdException w:name="Table List 1" w:semiHidden="1" w:unhideWhenUsed="1"/>
-    <w:lsdException w:name="Table List 2" w:semiHidden="1" w:unhideWhenUsed="1"/>
-    <w:lsdException w:name="Table List 3" w:semiHidden="1" w:unhideWhenUsed="1"/>
-    <w:lsdException w:name="Table List 4" w:semiHidden="1" w:unhideWhenUsed="1"/>
-    <w:lsdException w:name="Table List 5" w:semiHidden="1" w:unhideWhenUsed="1"/>
-    <w:lsdException w:name="Table List 6" w:semiHidden="1" w:unhideWhenUsed="1"/>
-    <w:lsdException w:name="Table List 7" w:semiHidden="1" w:unhideWhenUsed="1"/>
-    <w:lsdException w:name="Table List 8" w:semiHidden="1" w:unhideWhenUsed="1"/>
-    <w:lsdException w:name="Table 3D effects 1" w:semiHidden="1" w:unhideWhenUsed="1"/>
-    <w:lsdException w:name="Table 3D effects 2" w:semiHidden="1" w:unhideWhenUsed="1"/>
-    <w:lsdException w:name="Table 3D effects 3" w:semiHidden="1" w:unhideWhenUsed="1"/>
-    <w:lsdException w:name="Table Contemporary" w:semiHidden="1" w:unhideWhenUsed="1"/>
-    <w:lsdException w:name="Table Elegant" w:semiHidden="1" w:unhideWhenUsed="1"/>
-    <w:lsdException w:name="Table Professional" w:semiHidden="1" w:unhideWhenUsed="1"/>
-    <w:lsdException w:name="Table Subtle 1" w:semiHidden="1" w:unhideWhenUsed="1"/>
-    <w:lsdException w:name="Table Subtle 2" w:semiHidden="1" w:unhideWhenUsed="1"/>
-    <w:lsdException w:name="Table Web 1" w:semiHidden="1" w:unhideWhenUsed="1"/>
-    <w:lsdException w:name="Table Web 2" w:semiHidden="1" w:unhideWhenUsed="1"/>
-    <w:lsdException w:name="Table Web 3" w:semiHidden="1" w:unhideWhenUsed="1"/>
-    <w:lsdException w:name="Balloon Text" w:semiHidden="1" w:unhideWhenUsed="1"/>
-    <w:lsdException w:name="Table Grid" w:uiPriority="39"/>
-    <w:lsdException w:name="Table Theme" w:semiHidden="1" w:unhideWhenUsed="1"/>
-    <w:lsdException w:name="Placeholder Text" w:semiHidden="1"/>
-    <w:lsdException w:name="No Spacing" w:uiPriority="1" w:qFormat="1"/>
-    <w:lsdException w:name="Light Shading" w:uiPriority="60"/>
-    <w:lsdException w:name="Light List" w:uiPriority="61"/>
-    <w:lsdException w:name="Light Grid" w:uiPriority="62"/>
-    <w:lsdException w:name="Medium Shading 1" w:uiPriority="63"/>
-    <w:lsdException w:name="Medium Shading 2" w:uiPriority="64"/>
-    <w:lsdException w:name="Medium List 1" w:uiPriority="65"/>
-    <w:lsdException w:name="Medium List 2" w:uiPriority="66"/>
-    <w:lsdException w:name="Medium Grid 1" w:uiPriority="67"/>
-    <w:lsdException w:name="Medium Grid 2" w:uiPriority="68"/>
-    <w:lsdException w:name="Medium Grid 3" w:uiPriority="69"/>
-    <w:lsdException w:name="Dark List" w:uiPriority="70"/>
-    <w:lsdException w:name="Colorful Shading" w:uiPriority="71"/>
-    <w:lsdException w:name="Colorful List" w:uiPriority="72"/>
-    <w:lsdException w:name="Colorful Grid" w:uiPriority="73"/>
-    <w:lsdException w:name="Light Shading Accent 1" w:uiPriority="60"/>
-    <w:lsdException w:name="Light List Accent 1" w:uiPriority="61"/>
-    <w:lsdException w:name="Light Grid Accent 1" w:uiPriority="62"/>
-    <w:lsdException w:name="Medium Shading 1 Accent 1" w:uiPriority="63"/>
-    <w:lsdException w:name="Medium Shading 2 Accent 1" w:uiPriority="64"/>
-    <w:lsdException w:name="Medium List 1 Accent 1" w:uiPriority="65"/>
-    <w:lsdException w:name="Revision" w:semiHidden="1"/>
-    <w:lsdException w:name="List Paragraph" w:uiPriority="34" w:qFormat="1"/>
-    <w:lsdException w:name="Quote" w:uiPriority="29" w:qFormat="1"/>
-    <w:lsdException w:name="Intense Quote" w:uiPriority="30" w:qFormat="1"/>
-    <w:lsdException w:name="Medium List 2 Accent 1" w:uiPriority="66"/>
-    <w:lsdException w:name="Medium Grid 1 Accent 1" w:uiPriority="67"/>
-    <w:lsdException w:name="Medium Grid 2 Accent 1" w:uiPriority="68"/>
-    <w:lsdException w:name="Medium Grid 3 Accent 1" w:uiPriority="69"/>
-    <w:lsdException w:name="Dark List Accent 1" w:uiPriority="70"/>
-    <w:lsdException w:name="Colorful Shading Accent 1" w:uiPriority="71"/>
-    <w:lsdException w:name="Colorful List Accent 1" w:uiPriority="72"/>
-    <w:lsdException w:name="Colorful Grid Accent 1" w:uiPriority="73"/>
-    <w:lsdException w:name="Light Shading Accent 2" w:uiPriority="60"/>
-    <w:lsdException w:name="Light List Accent 2" w:uiPriority="61"/>
-    <w:lsdException w:name="Light Grid Accent 2" w:uiPriority="62"/>
-    <w:lsdException w:name="Medium Shading 1 Accent 2" w:uiPriority="63"/>
-    <w:lsdException w:name="Medium Shading 2 Accent 2" w:uiPriority="64"/>
-    <w:lsdException w:name="Medium List 1 Accent 2" w:uiPriority="65"/>
-    <w:lsdException w:name="Medium List 2 Accent 2" w:uiPriority="66"/>
-    <w:lsdException w:name="Medium Grid 1 Accent 2" w:uiPriority="67"/>
-    <w:lsdException w:name="Medium Grid 2 Accent 2" w:uiPriority="68"/>
-    <w:lsdException w:name="Medium Grid 3 Accent 2" w:uiPriority="69"/>
-    <w:lsdException w:name="Dark List Accent 2" w:uiPriority="70"/>
-    <w:lsdException w:name="Colorful Shading Accent 2" w:uiPriority="71"/>
-    <w:lsdException w:name="Colorful List Accent 2" w:uiPriority="72"/>
-    <w:lsdException w:name="Colorful Grid Accent 2" w:uiPriority="73"/>
-    <w:lsdException w:name="Light Shading Accent 3" w:uiPriority="60"/>
-    <w:lsdException w:name="Light List Accent 3" w:uiPriority="61"/>
-    <w:lsdException w:name="Light Grid Accent 3" w:uiPriority="62"/>
-    <w:lsdException w:name="Medium Shading 1 Accent 3" w:uiPriority="63"/>
-    <w:lsdException w:name="Medium Shading 2 Accent 3" w:uiPriority="64"/>
-    <w:lsdException w:name="Medium List 1 Accent 3" w:uiPriority="65"/>
-    <w:lsdException w:name="Medium List 2 Accent 3" w:uiPriority="66"/>
-    <w:lsdException w:name="Medium Grid 1 Accent 3" w:uiPriority="67"/>
-    <w:lsdException w:name="Medium Grid 2 Accent 3" w:uiPriority="68"/>
-    <w:lsdException w:name="Medium Grid 3 Accent 3" w:uiPriority="69"/>
-    <w:lsdException w:name="Dark List Accent 3" w:uiPriority="70"/>
-    <w:lsdException w:name="Colorful Shading Accent 3" w:uiPriority="71"/>
-    <w:lsdException w:name="Colorful List Accent 3" w:uiPriority="72"/>
-    <w:lsdException w:name="Colorful Grid Accent 3" w:uiPriority="73"/>
-    <w:lsdException w:name="Light Shading Accent 4" w:uiPriority="60"/>
-    <w:lsdException w:name="Light List Accent 4" w:uiPriority="61"/>
-    <w:lsdException w:name="Light Grid Accent 4" w:uiPriority="62"/>
-    <w:lsdException w:name="Medium Shading 1 Accent 4" w:uiPriority="63"/>
-    <w:lsdException w:name="Medium Shading 2 Accent 4" w:uiPriority="64"/>
-    <w:lsdException w:name="Medium List 1 Accent 4" w:uiPriority="65"/>
-    <w:lsdException w:name="Medium List 2 Accent 4" w:uiPriority="66"/>
-    <w:lsdException w:name="Medium Grid 1 Accent 4" w:uiPriority="67"/>
-    <w:lsdException w:name="Medium Grid 2 Accent 4" w:uiPriority="68"/>
-    <w:lsdException w:name="Medium Grid 3 Accent 4" w:uiPriority="69"/>
-    <w:lsdException w:name="Dark List Accent 4" w:uiPriority="70"/>
-    <w:lsdException w:name="Colorful Shading Accent 4" w:uiPriority="71"/>
-    <w:lsdException w:name="Colorful List Accent 4" w:uiPriority="72"/>
-    <w:lsdException w:name="Colorful Grid Accent 4" w:uiPriority="73"/>
-    <w:lsdException w:name="Light Shading Accent 5" w:uiPriority="60"/>
-    <w:lsdException w:name="Light List Accent 5" w:uiPriority="61"/>
-    <w:lsdException w:name="Light Grid Accent 5" w:uiPriority="62"/>
-    <w:lsdException w:name="Medium Shading 1 Accent 5" w:uiPriority="63"/>
-    <w:lsdException w:name="Medium Shading 2 Accent 5" w:uiPriority="64"/>
-    <w:lsdException w:name="Medium List 1 Accent 5" w:uiPriority="65"/>
-    <w:lsdException w:name="Medium List 2 Accent 5" w:uiPriority="66"/>
-    <w:lsdException w:name="Medium Grid 1 Accent 5" w:uiPriority="67"/>
-    <w:lsdException w:name="Medium Grid 2 Accent 5" w:uiPriority="68"/>
-    <w:lsdException w:name="Medium Grid 3 Accent 5" w:uiPriority="69"/>
-    <w:lsdException w:name="Dark List Accent 5" w:uiPriority="70"/>
-    <w:lsdException w:name="Colorful Shading Accent 5" w:uiPriority="71"/>
-    <w:lsdException w:name="Colorful List Accent 5" w:uiPriority="72"/>
-    <w:lsdException w:name="Colorful Grid Accent 5" w:uiPriority="73"/>
-    <w:lsdException w:name="Light Shading Accent 6" w:uiPriority="60"/>
-    <w:lsdException w:name="Light List Accent 6" w:uiPriority="61"/>
-    <w:lsdException w:name="Light Grid Accent 6" w:uiPriority="62"/>
-    <w:lsdException w:name="Medium Shading 1 Accent 6" w:uiPriority="63"/>
-    <w:lsdException w:name="Medium Shading 2 Accent 6" w:uiPriority="64"/>
-    <w:lsdException w:name="Medium List 1 Accent 6" w:uiPriority="65"/>
-    <w:lsdException w:name="Medium List 2 Accent 6" w:uiPriority="66"/>
-    <w:lsdException w:name="Medium Grid 1 Accent 6" w:uiPriority="67"/>
-    <w:lsdException w:name="Medium Grid 2 Accent 6" w:uiPriority="68"/>
-    <w:lsdException w:name="Medium Grid 3 Accent 6" w:uiPriority="69"/>
-    <w:lsdException w:name="Dark List Accent 6" w:uiPriority="70"/>
-    <w:lsdException w:name="Colorful Shading Accent 6" w:uiPriority="71"/>
-    <w:lsdException w:name="Colorful List Accent 6" w:uiPriority="72"/>
-    <w:lsdException w:name="Colorful Grid Accent 6" w:uiPriority="73"/>
-    <w:lsdException w:name="Subtle Emphasis" w:uiPriority="19" w:qFormat="1"/>
-    <w:lsdException w:name="Intense Emphasis" w:uiPriority="21" w:qFormat="1"/>
-    <w:lsdException w:name="Subtle Reference" w:uiPriority="31" w:qFormat="1"/>
-    <w:lsdException w:name="Intense Reference" w:uiPriority="32" w:qFormat="1"/>
-    <w:lsdException w:name="Book Title" w:uiPriority="33" w:qFormat="1"/>
-    <w:lsdException w:name="Bibliography" w:semiHidden="1" w:uiPriority="37" w:unhideWhenUsed="1"/>
-    <w:lsdException w:name="TOC Heading" w:semiHidden="1" w:uiPriority="39" w:unhideWhenUsed="1" w:qFormat="1"/>
-    <w:lsdException w:name="Plain Table 1" w:uiPriority="41"/>
-    <w:lsdException w:name="Plain Table 2" w:uiPriority="42"/>
-    <w:lsdException w:name="Plain Table 3" w:uiPriority="43"/>
-    <w:lsdException w:name="Plain Table 4" w:uiPriority="44"/>
-    <w:lsdException w:name="Plain Table 5" w:uiPriority="45"/>
-    <w:lsdException w:name="Grid Table Light" w:uiPriority="40"/>
-    <w:lsdException w:name="Grid Table 1 Light" w:uiPriority="46"/>
-    <w:lsdException w:name="Grid Table 2" w:uiPriority="47"/>
-    <w:lsdException w:name="Grid Table 3" w:uiPriority="48"/>
-    <w:lsdException w:name="Grid Table 4" w:uiPriority="49"/>
-    <w:lsdException w:name="Grid Table 5 Dark" w:uiPriority="50"/>
-    <w:lsdException w:name="Grid Table 6 Colorful" w:uiPriority="51"/>
-    <w:lsdException w:name="Grid Table 7 Colorful" w:uiPriority="52"/>
-    <w:lsdException w:name="Grid Table 1 Light Accent 1" w:uiPriority="46"/>
-    <w:lsdException w:name="Grid Table 2 Accent 1" w:uiPriority="47"/>
-    <w:lsdException w:name="Grid Table 3 Accent 1" w:uiPriority="48"/>
-    <w:lsdException w:name="Grid Table 4 Accent 1" w:uiPriority="49"/>
-    <w:lsdException w:name="Grid Table 5 Dark Accent 1" w:uiPriority="50"/>
-    <w:lsdException w:name="Grid Table 6 Colorful Accent 1" w:uiPriority="51"/>
-    <w:lsdException w:name="Grid Table 7 Colorful Accent 1" w:uiPriority="52"/>
-    <w:lsdException w:name="Grid Table 1 Light Accent 2" w:uiPriority="46"/>
-    <w:lsdException w:name="Grid Table 2 Accent 2" w:uiPriority="47"/>
-    <w:lsdException w:name="Grid Table 3 Accent 2" w:uiPriority="48"/>
-    <w:lsdException w:name="Grid Table 4 Accent 2" w:uiPriority="49"/>
-    <w:lsdException w:name="Grid Table 5 Dark Accent 2" w:uiPriority="50"/>
-    <w:lsdException w:name="Grid Table 6 Colorful Accent 2" w:uiPriority="51"/>
-    <w:lsdException w:name="Grid Table 7 Colorful Accent 2" w:uiPriority="52"/>
-    <w:lsdException w:name="Grid Table 1 Light Accent 3" w:uiPriority="46"/>
-    <w:lsdException w:name="Grid Table 2 Accent 3" w:uiPriority="47"/>
-    <w:lsdException w:name="Grid Table 3 Accent 3" w:uiPriority="48"/>
-    <w:lsdException w:name="Grid Table 4 Accent 3" w:uiPriority="49"/>
-    <w:lsdException w:name="Grid Table 5 Dark Accent 3" w:uiPriority="50"/>
-    <w:lsdException w:name="Grid Table 6 Colorful Accent 3" w:uiPriority="51"/>
-    <w:lsdException w:name="Grid Table 7 Colorful Accent 3" w:uiPriority="52"/>
-    <w:lsdException w:name="Grid Table 1 Light Accent 4" w:uiPriority="46"/>
-    <w:lsdException w:name="Grid Table 2 Accent 4" w:uiPriority="47"/>
-    <w:lsdException w:name="Grid Table 3 Accent 4" w:uiPriority="48"/>
-    <w:lsdException w:name="Grid Table 4 Accent 4" w:uiPriority="49"/>
-    <w:lsdException w:name="Grid Table 5 Dark Accent 4" w:uiPriority="50"/>
-    <w:lsdException w:name="Grid Table 6 Colorful Accent 4" w:uiPriority="51"/>
-    <w:lsdException w:name="Grid Table 7 Colorful Accent 4" w:uiPriority="52"/>
-    <w:lsdException w:name="Grid Table 1 Light Accent 5" w:uiPriority="46"/>
-    <w:lsdException w:name="Grid Table 2 Accent 5" w:uiPriority="47"/>
-    <w:lsdException w:name="Grid Table 3 Accent 5" w:uiPriority="48"/>
-    <w:lsdException w:name="Grid Table 4 Accent 5" w:uiPriority="49"/>
-    <w:lsdException w:name="Grid Table 5 Dark Accent 5" w:uiPriority="50"/>
-    <w:lsdException w:name="Grid Table 6 Colorful Accent 5" w:uiPriority="51"/>
-    <w:lsdException w:name="Grid Table 7 Colorful Accent 5" w:uiPriority="52"/>
-    <w:lsdException w:name="Grid Table 1 Light Accent 6" w:uiPriority="46"/>
-    <w:lsdException w:name="Grid Table 2 Accent 6" w:uiPriority="47"/>
-    <w:lsdException w:name="Grid Table 3 Accent 6" w:uiPriority="48"/>
-    <w:lsdException w:name="Grid Table 4 Accent 6" w:uiPriority="49"/>
-    <w:lsdException w:name="Grid Table 5 Dark Accent 6" w:uiPriority="50"/>
-    <w:lsdException w:name="Grid Table 6 Colorful Accent 6" w:uiPriority="51"/>
-    <w:lsdException w:name="Grid Table 7 Colorful Accent 6" w:uiPriority="52"/>
-    <w:lsdException w:name="List Table 1 Light" w:uiPriority="46"/>
-    <w:lsdException w:name="List Table 2" w:uiPriority="47"/>
-    <w:lsdException w:name="List Table 3" w:uiPriority="48"/>
-    <w:lsdException w:name="List Table 4" w:uiPriority="49"/>
-    <w:lsdException w:name="List Table 5 Dark" w:uiPriority="50"/>
-    <w:lsdException w:name="List Table 6 Colorful" w:uiPriority="51"/>
-    <w:lsdException w:name="List Table 7 Colorful" w:uiPriority="52"/>
-    <w:lsdException w:name="List Table 1 Light Accent 1" w:uiPriority="46"/>
-    <w:lsdException w:name="List Table 2 Accent 1" w:uiPriority="47"/>
-    <w:lsdException w:name="List Table 3 Accent 1" w:uiPriority="48"/>
-    <w:lsdException w:name="List Table 4 Accent 1" w:uiPriority="49"/>
-    <w:lsdException w:name="List Table 5 Dark Accent 1" w:uiPriority="50"/>
-    <w:lsdException w:name="List Table 6 Colorful Accent 1" w:uiPriority="51"/>
-    <w:lsdException w:name="List Table 7 Colorful Accent 1" w:uiPriority="52"/>
-    <w:lsdException w:name="List Table 1 Light Accent 2" w:uiPriority="46"/>
-    <w:lsdException w:name="List Table 2 Accent 2" w:uiPriority="47"/>
-    <w:lsdException w:name="List Table 3 Accent 2" w:uiPriority="48"/>
-    <w:lsdException w:name="List Table 4 Accent 2" w:uiPriority="49"/>
-    <w:lsdException w:name="List Table 5 Dark Accent 2" w:uiPriority="50"/>
-    <w:lsdException w:name="List Table 6 Colorful Accent 2" w:uiPriority="51"/>
-    <w:lsdException w:name="List Table 7 Colorful Accent 2" w:uiPriority="52"/>
-    <w:lsdException w:name="List Table 1 Light Accent 3" w:uiPriority="46"/>
-    <w:lsdException w:name="List Table 2 Accent 3" w:uiPriority="47"/>
-    <w:lsdException w:name="List Table 3 Accent 3" w:uiPriority="48"/>
-    <w:lsdException w:name="List Table 4 Accent 3" w:uiPriority="49"/>
-    <w:lsdException w:name="List Table 5 Dark Accent 3" w:uiPriority="50"/>
-    <w:lsdException w:name="List Table 6 Colorful Accent 3" w:uiPriority="51"/>
-    <w:lsdException w:name="List Table 7 Colorful Accent 3" w:uiPriority="52"/>
-    <w:lsdException w:name="List Table 1 Light Accent 4" w:uiPriority="46"/>
-    <w:lsdException w:name="List Table 2 Accent 4" w:uiPriority="47"/>
-    <w:lsdException w:name="List Table 3 Accent 4" w:uiPriority="48"/>
-    <w:lsdException w:name="List Table 4 Accent 4" w:uiPriority="49"/>
-    <w:lsdException w:name="List Table 5 Dark Accent 4" w:uiPriority="50"/>
-    <w:lsdException w:name="List Table 6 Colorful Accent 4" w:uiPriority="51"/>
-    <w:lsdException w:name="List Table 7 Colorful Accent 4" w:uiPriority="52"/>
-    <w:lsdException w:name="List Table 1 Light Accent 5" w:uiPriority="46"/>
-    <w:lsdException w:name="List Table 2 Accent 5" w:uiPriority="47"/>
-    <w:lsdException w:name="List Table 3 Accent 5" w:uiPriority="48"/>
-    <w:lsdException w:name="List Table 4 Accent 5" w:uiPriority="49"/>
-    <w:lsdException w:name="List Table 5 Dark Accent 5" w:uiPriority="50"/>
-    <w:lsdException w:name="List Table 6 Colorful Accent 5" w:uiPriority="51"/>
-    <w:lsdException w:name="List Table 7 Colorful Accent 5" w:uiPriority="52"/>
-    <w:lsdException w:name="List Table 1 Light Accent 6" w:uiPriority="46"/>
-    <w:lsdException w:name="List Table 2 Accent 6" w:uiPriority="47"/>
-    <w:lsdException w:name="List Table 3 Accent 6" w:uiPriority="48"/>
-    <w:lsdException w:name="List Table 4 Accent 6" w:uiPriority="49"/>
-    <w:lsdException w:name="List Table 5 Dark Accent 6" w:uiPriority="50"/>
-    <w:lsdException w:name="List Table 6 Colorful Accent 6" w:uiPriority="51"/>
-    <w:lsdException w:name="List Table 7 Colorful Accent 6" w:uiPriority="52"/>
-    <w:lsdException w:name="Mention" w:semiHidden="1" w:unhideWhenUsed="1"/>
-    <w:lsdException w:name="Smart Hyperlink" w:semiHidden="1" w:unhideWhenUsed="1"/>
-    <w:lsdException w:name="Hashtag" w:semiHidden="1" w:unhideWhenUsed="1"/>
-    <w:lsdException w:name="Unresolved Mention" w:semiHidden="1" w:unhideWhenUsed="1"/>
-    <w:lsdException w:name="Smart Link" w:semiHidden="1" w:unhideWhenUsed="1"/>
+  <w:latentStyles w:count="260" w:defQFormat="0" w:defUnhideWhenUsed="1" w:defSemiHidden="1" w:defUIPriority="99" w:defLockedState="0">
+    <w:lsdException w:qFormat="1" w:unhideWhenUsed="0" w:uiPriority="0" w:semiHidden="0" w:name="Normal"/>
+    <w:lsdException w:qFormat="1" w:unhideWhenUsed="0" w:uiPriority="9" w:semiHidden="0" w:name="heading 1"/>
+    <w:lsdException w:qFormat="1" w:uiPriority="9" w:semiHidden="0" w:name="heading 2"/>
+    <w:lsdException w:qFormat="1" w:uiPriority="9" w:name="heading 3"/>
+    <w:lsdException w:qFormat="1" w:uiPriority="9" w:name="heading 4"/>
+    <w:lsdException w:qFormat="1" w:uiPriority="9" w:name="heading 5"/>
+    <w:lsdException w:qFormat="1" w:uiPriority="9" w:name="heading 6"/>
+    <w:lsdException w:qFormat="1" w:uiPriority="9" w:name="heading 7"/>
+    <w:lsdException w:qFormat="1" w:uiPriority="9" w:name="heading 8"/>
+    <w:lsdException w:qFormat="1" w:uiPriority="9" w:name="heading 9"/>
+    <w:lsdException w:uiPriority="99" w:name="index 1"/>
+    <w:lsdException w:uiPriority="99" w:name="index 2"/>
+    <w:lsdException w:uiPriority="99" w:name="index 3"/>
+    <w:lsdException w:uiPriority="99" w:name="index 4"/>
+    <w:lsdException w:uiPriority="99" w:name="index 5"/>
+    <w:lsdException w:uiPriority="99" w:name="index 6"/>
+    <w:lsdException w:uiPriority="99" w:name="index 7"/>
+    <w:lsdException w:uiPriority="99" w:name="index 8"/>
+    <w:lsdException w:uiPriority="99" w:name="index 9"/>
+    <w:lsdException w:uiPriority="39" w:name="toc 1"/>
+    <w:lsdException w:uiPriority="39" w:name="toc 2"/>
+    <w:lsdException w:uiPriority="39" w:name="toc 3"/>
+    <w:lsdException w:uiPriority="39" w:name="toc 4"/>
+    <w:lsdException w:uiPriority="39" w:name="toc 5"/>
+    <w:lsdException w:uiPriority="39" w:name="toc 6"/>
+    <w:lsdException w:uiPriority="39" w:name="toc 7"/>
+    <w:lsdException w:uiPriority="39" w:name="toc 8"/>
+    <w:lsdException w:uiPriority="39" w:name="toc 9"/>
+    <w:lsdException w:uiPriority="99" w:name="Normal Indent"/>
+    <w:lsdException w:uiPriority="99" w:name="footnote text"/>
+    <w:lsdException w:uiPriority="99" w:name="annotation text"/>
+    <w:lsdException w:uiPriority="99" w:name="header"/>
+    <w:lsdException w:uiPriority="99" w:name="footer"/>
+    <w:lsdException w:uiPriority="99" w:name="index heading"/>
+    <w:lsdException w:unhideWhenUsed="0" w:uiPriority="0" w:semiHidden="0" w:name="caption"/>
+    <w:lsdException w:uiPriority="99" w:name="table of figures"/>
+    <w:lsdException w:uiPriority="99" w:name="envelope address"/>
+    <w:lsdException w:uiPriority="99" w:name="envelope return"/>
+    <w:lsdException w:uiPriority="99" w:name="footnote reference"/>
+    <w:lsdException w:uiPriority="99" w:name="annotation reference"/>
+    <w:lsdException w:uiPriority="99" w:name="line number"/>
+    <w:lsdException w:uiPriority="99" w:name="page number"/>
+    <w:lsdException w:uiPriority="99" w:name="endnote reference"/>
+    <w:lsdException w:uiPriority="99" w:name="endnote text"/>
+    <w:lsdException w:uiPriority="99" w:name="table of authorities"/>
+    <w:lsdException w:uiPriority="99" w:name="macro"/>
+    <w:lsdException w:uiPriority="99" w:name="toa heading"/>
+    <w:lsdException w:unhideWhenUsed="0" w:uiPriority="0" w:semiHidden="0" w:name="List"/>
+    <w:lsdException w:uiPriority="99" w:name="List Bullet"/>
+    <w:lsdException w:uiPriority="99" w:name="List Number"/>
+    <w:lsdException w:uiPriority="99" w:name="List 2"/>
+    <w:lsdException w:uiPriority="99" w:name="List 3"/>
+    <w:lsdException w:uiPriority="99" w:name="List 4"/>
+    <w:lsdException w:uiPriority="99" w:name="List 5"/>
+    <w:lsdException w:uiPriority="99" w:name="List Bullet 2"/>
+    <w:lsdException w:uiPriority="99" w:name="List Bullet 3"/>
+    <w:lsdException w:uiPriority="99" w:name="List Bullet 4"/>
+    <w:lsdException w:uiPriority="99" w:name="List Bullet 5"/>
+    <w:lsdException w:uiPriority="99" w:name="List Number 2"/>
+    <w:lsdException w:uiPriority="99" w:name="List Number 3"/>
+    <w:lsdException w:uiPriority="99" w:name="List Number 4"/>
+    <w:lsdException w:uiPriority="99" w:name="List Number 5"/>
+    <w:lsdException w:qFormat="1" w:unhideWhenUsed="0" w:uiPriority="10" w:semiHidden="0" w:name="Title"/>
+    <w:lsdException w:uiPriority="99" w:name="Closing"/>
+    <w:lsdException w:uiPriority="99" w:name="Signature"/>
+    <w:lsdException w:uiPriority="1" w:name="Default Paragraph Font"/>
+    <w:lsdException w:unhideWhenUsed="0" w:uiPriority="0" w:semiHidden="0" w:name="Body Text"/>
+    <w:lsdException w:unhideWhenUsed="0" w:uiPriority="0" w:semiHidden="0" w:name="Body Text Indent"/>
+    <w:lsdException w:uiPriority="99" w:name="List Continue"/>
+    <w:lsdException w:uiPriority="99" w:name="List Continue 2"/>
+    <w:lsdException w:uiPriority="99" w:name="List Continue 3"/>
+    <w:lsdException w:uiPriority="99" w:name="List Continue 4"/>
+    <w:lsdException w:uiPriority="99" w:name="List Continue 5"/>
+    <w:lsdException w:uiPriority="99" w:name="Message Header"/>
+    <w:lsdException w:qFormat="1" w:unhideWhenUsed="0" w:uiPriority="11" w:semiHidden="0" w:name="Subtitle"/>
+    <w:lsdException w:uiPriority="99" w:name="Salutation"/>
+    <w:lsdException w:uiPriority="99" w:name="Date"/>
+    <w:lsdException w:uiPriority="99" w:name="Body Text First Indent"/>
+    <w:lsdException w:uiPriority="99" w:name="Body Text First Indent 2"/>
+    <w:lsdException w:uiPriority="99" w:name="Note Heading"/>
+    <w:lsdException w:uiPriority="99" w:name="Body Text 2"/>
+    <w:lsdException w:uiPriority="99" w:name="Body Text 3"/>
+    <w:lsdException w:uiPriority="99" w:name="Body Text Indent 2"/>
+    <w:lsdException w:uiPriority="99" w:name="Body Text Indent 3"/>
+    <w:lsdException w:uiPriority="99" w:name="Block Text"/>
+    <w:lsdException w:uiPriority="99" w:name="Hyperlink"/>
+    <w:lsdException w:uiPriority="99" w:name="FollowedHyperlink"/>
+    <w:lsdException w:qFormat="1" w:unhideWhenUsed="0" w:uiPriority="22" w:semiHidden="0" w:name="Strong"/>
+    <w:lsdException w:qFormat="1" w:unhideWhenUsed="0" w:uiPriority="20" w:semiHidden="0" w:name="Emphasis"/>
+    <w:lsdException w:uiPriority="99" w:name="Document Map"/>
+    <w:lsdException w:uiPriority="99" w:name="Plain Text"/>
+    <w:lsdException w:uiPriority="99" w:name="E-mail Signature"/>
+    <w:lsdException w:uiPriority="99" w:name="Normal (Web)"/>
+    <w:lsdException w:uiPriority="99" w:name="HTML Acronym"/>
+    <w:lsdException w:uiPriority="99" w:name="HTML Address"/>
+    <w:lsdException w:uiPriority="99" w:name="HTML Cite"/>
+    <w:lsdException w:uiPriority="99" w:name="HTML Code"/>
+    <w:lsdException w:uiPriority="99" w:name="HTML Definition"/>
+    <w:lsdException w:uiPriority="99" w:name="HTML Keyboard"/>
+    <w:lsdException w:uiPriority="99" w:name="HTML Preformatted"/>
+    <w:lsdException w:uiPriority="99" w:name="HTML Sample"/>
+    <w:lsdException w:uiPriority="99" w:name="HTML Typewriter"/>
+    <w:lsdException w:uiPriority="99" w:name="HTML Variable"/>
+    <w:lsdException w:uiPriority="99" w:name="Normal Table"/>
+    <w:lsdException w:uiPriority="99" w:name="annotation subject"/>
+    <w:lsdException w:uiPriority="99" w:name="Table Simple 1"/>
+    <w:lsdException w:uiPriority="99" w:name="Table Simple 2"/>
+    <w:lsdException w:uiPriority="99" w:name="Table Simple 3"/>
+    <w:lsdException w:uiPriority="99" w:name="Table Classic 1"/>
+    <w:lsdException w:uiPriority="99" w:name="Table Classic 2"/>
+    <w:lsdException w:uiPriority="99" w:name="Table Classic 3"/>
+    <w:lsdException w:uiPriority="99" w:name="Table Classic 4"/>
+    <w:lsdException w:uiPriority="99" w:name="Table Colorful 1"/>
+    <w:lsdException w:uiPriority="99" w:name="Table Colorful 2"/>
+    <w:lsdException w:uiPriority="99" w:name="Table Colorful 3"/>
+    <w:lsdException w:uiPriority="99" w:name="Table Columns 1"/>
+    <w:lsdException w:uiPriority="99" w:name="Table Columns 2"/>
+    <w:lsdException w:uiPriority="99" w:name="Table Columns 3"/>
+    <w:lsdException w:uiPriority="99" w:name="Table Columns 4"/>
+    <w:lsdException w:uiPriority="99" w:name="Table Columns 5"/>
+    <w:lsdException w:uiPriority="99" w:name="Table Grid 1"/>
+    <w:lsdException w:uiPriority="99" w:name="Table Grid 2"/>
+    <w:lsdException w:uiPriority="99" w:name="Table Grid 3"/>
+    <w:lsdException w:uiPriority="99" w:name="Table Grid 4"/>
+    <w:lsdException w:uiPriority="99" w:name="Table Grid 5"/>
+    <w:lsdException w:uiPriority="99" w:name="Table Grid 6"/>
+    <w:lsdException w:uiPriority="99" w:name="Table Grid 7"/>
+    <w:lsdException w:uiPriority="99" w:name="Table Grid 8"/>
+    <w:lsdException w:uiPriority="99" w:name="Table List 1"/>
+    <w:lsdException w:uiPriority="99" w:name="Table List 2"/>
+    <w:lsdException w:uiPriority="99" w:name="Table List 3"/>
+    <w:lsdException w:uiPriority="99" w:name="Table List 4"/>
+    <w:lsdException w:uiPriority="99" w:name="Table List 5"/>
+    <w:lsdException w:uiPriority="99" w:name="Table List 6"/>
+    <w:lsdException w:uiPriority="99" w:name="Table List 7"/>
+    <w:lsdException w:uiPriority="99" w:name="Table List 8"/>
+    <w:lsdException w:uiPriority="99" w:name="Table 3D effects 1"/>
+    <w:lsdException w:uiPriority="99" w:name="Table 3D effects 2"/>
+    <w:lsdException w:uiPriority="99" w:name="Table 3D effects 3"/>
+    <w:lsdException w:uiPriority="99" w:name="Table Contemporary"/>
+    <w:lsdException w:uiPriority="99" w:name="Table Elegant"/>
+    <w:lsdException w:uiPriority="99" w:name="Table Professional"/>
+    <w:lsdException w:uiPriority="99" w:name="Table Subtle 1"/>
+    <w:lsdException w:uiPriority="99" w:name="Table Subtle 2"/>
+    <w:lsdException w:uiPriority="99" w:name="Table Web 1"/>
+    <w:lsdException w:uiPriority="99" w:name="Table Web 2"/>
+    <w:lsdException w:uiPriority="99" w:name="Table Web 3"/>
+    <w:lsdException w:uiPriority="99" w:name="Balloon Text"/>
+    <w:lsdException w:unhideWhenUsed="0" w:uiPriority="39" w:semiHidden="0" w:name="Table Grid"/>
+    <w:lsdException w:uiPriority="99" w:name="Table Theme"/>
   </w:latentStyles>
-  <w:style w:type="paragraph" w:default="1" w:styleId="Normal">
+  <w:style w:type="paragraph" w:default="1" w:styleId="1">
     <w:name w:val="Normal"/>
     <w:qFormat/>
-  </w:style>
-  <w:style w:type="paragraph" w:styleId="Ttulo1">
+    <w:uiPriority w:val="0"/>
+    <w:rPr>
+      <w:rFonts w:ascii="Times New Roman" w:hAnsi="Times New Roman" w:eastAsia="Times New Roman" w:cs="Times New Roman"/>
+      <w:sz w:val="24"/>
+      <w:szCs w:val="24"/>
+      <w:lang w:val="pt-BR" w:eastAsia="pt-BR" w:bidi="ar-SA"/>
+    </w:rPr>
+  </w:style>
+  <w:style w:type="paragraph" w:styleId="2">
     <w:name w:val="heading 1"/>
-    <w:basedOn w:val="Normal"/>
-    <w:next w:val="Normal"/>
+    <w:basedOn w:val="1"/>
+    <w:next w:val="1"/>
+    <w:qFormat/>
     <w:uiPriority w:val="9"/>
-    <w:qFormat/>
     <w:pPr>
       <w:keepNext/>
       <w:outlineLvl w:val="0"/>
@@ -1641,13 +1646,13 @@
       <w:szCs w:val="28"/>
     </w:rPr>
   </w:style>
-  <w:style w:type="paragraph" w:styleId="Ttulo2">
+  <w:style w:type="paragraph" w:styleId="3">
     <w:name w:val="heading 2"/>
-    <w:basedOn w:val="Normal"/>
-    <w:next w:val="Normal"/>
-    <w:uiPriority w:val="9"/>
+    <w:basedOn w:val="1"/>
+    <w:next w:val="1"/>
     <w:unhideWhenUsed/>
     <w:qFormat/>
+    <w:uiPriority w:val="9"/>
     <w:pPr>
       <w:keepNext/>
       <w:jc w:val="center"/>
@@ -1658,14 +1663,14 @@
       <w:szCs w:val="28"/>
     </w:rPr>
   </w:style>
-  <w:style w:type="paragraph" w:styleId="Ttulo3">
+  <w:style w:type="paragraph" w:styleId="4">
     <w:name w:val="heading 3"/>
-    <w:basedOn w:val="Normal"/>
-    <w:next w:val="Normal"/>
-    <w:uiPriority w:val="9"/>
+    <w:basedOn w:val="1"/>
+    <w:next w:val="1"/>
     <w:semiHidden/>
     <w:unhideWhenUsed/>
     <w:qFormat/>
+    <w:uiPriority w:val="9"/>
     <w:pPr>
       <w:keepNext/>
       <w:keepLines/>
@@ -1678,14 +1683,14 @@
       <w:szCs w:val="28"/>
     </w:rPr>
   </w:style>
-  <w:style w:type="paragraph" w:styleId="Ttulo4">
+  <w:style w:type="paragraph" w:styleId="5">
     <w:name w:val="heading 4"/>
-    <w:basedOn w:val="Normal"/>
-    <w:next w:val="Normal"/>
-    <w:uiPriority w:val="9"/>
+    <w:basedOn w:val="1"/>
+    <w:next w:val="1"/>
     <w:semiHidden/>
     <w:unhideWhenUsed/>
     <w:qFormat/>
+    <w:uiPriority w:val="9"/>
     <w:pPr>
       <w:keepNext/>
       <w:keepLines/>
@@ -1696,14 +1701,14 @@
       <w:b/>
     </w:rPr>
   </w:style>
-  <w:style w:type="paragraph" w:styleId="Ttulo5">
+  <w:style w:type="paragraph" w:styleId="6">
     <w:name w:val="heading 5"/>
-    <w:basedOn w:val="Normal"/>
-    <w:next w:val="Normal"/>
-    <w:uiPriority w:val="9"/>
+    <w:basedOn w:val="1"/>
+    <w:next w:val="1"/>
     <w:semiHidden/>
     <w:unhideWhenUsed/>
     <w:qFormat/>
+    <w:uiPriority w:val="9"/>
     <w:pPr>
       <w:keepNext/>
       <w:keepLines/>
@@ -1716,14 +1721,14 @@
       <w:szCs w:val="22"/>
     </w:rPr>
   </w:style>
-  <w:style w:type="paragraph" w:styleId="Ttulo6">
+  <w:style w:type="paragraph" w:styleId="7">
     <w:name w:val="heading 6"/>
-    <w:basedOn w:val="Normal"/>
-    <w:next w:val="Normal"/>
-    <w:uiPriority w:val="9"/>
+    <w:basedOn w:val="1"/>
+    <w:next w:val="1"/>
     <w:semiHidden/>
     <w:unhideWhenUsed/>
     <w:qFormat/>
+    <w:uiPriority w:val="9"/>
     <w:pPr>
       <w:keepNext/>
       <w:keepLines/>
@@ -1736,19 +1741,18 @@
       <w:szCs w:val="20"/>
     </w:rPr>
   </w:style>
-  <w:style w:type="character" w:default="1" w:styleId="Fontepargpadro">
+  <w:style w:type="character" w:default="1" w:styleId="8">
     <w:name w:val="Default Paragraph Font"/>
-    <w:uiPriority w:val="1"/>
     <w:semiHidden/>
     <w:unhideWhenUsed/>
-  </w:style>
-  <w:style w:type="table" w:default="1" w:styleId="Tabelanormal">
+    <w:uiPriority w:val="1"/>
+  </w:style>
+  <w:style w:type="table" w:default="1" w:styleId="9">
     <w:name w:val="Normal Table"/>
-    <w:uiPriority w:val="99"/>
     <w:semiHidden/>
     <w:unhideWhenUsed/>
+    <w:uiPriority w:val="99"/>
     <w:tblPr>
-      <w:tblInd w:w="0" w:type="dxa"/>
       <w:tblCellMar>
         <w:top w:w="0" w:type="dxa"/>
         <w:left w:w="108" w:type="dxa"/>
@@ -1757,14 +1761,108 @@
       </w:tblCellMar>
     </w:tblPr>
   </w:style>
-  <w:style w:type="numbering" w:default="1" w:styleId="Semlista">
-    <w:name w:val="No List"/>
-    <w:uiPriority w:val="99"/>
-    <w:semiHidden/>
-    <w:unhideWhenUsed/>
-  </w:style>
-  <w:style w:type="table" w:customStyle="1" w:styleId="TableNormal">
+  <w:style w:type="paragraph" w:styleId="10">
+    <w:name w:val="List"/>
+    <w:basedOn w:val="11"/>
+    <w:uiPriority w:val="0"/>
+    <w:rPr>
+      <w:rFonts w:cs="Noto Sans Devanagari"/>
+    </w:rPr>
+  </w:style>
+  <w:style w:type="paragraph" w:styleId="11">
+    <w:name w:val="Body Text"/>
+    <w:basedOn w:val="1"/>
+    <w:uiPriority w:val="0"/>
+    <w:pPr>
+      <w:spacing w:after="140" w:line="276" w:lineRule="auto"/>
+      <w:ind w:left="-1" w:leftChars="-1" w:hanging="1" w:hangingChars="1"/>
+      <w:textAlignment w:val="top"/>
+      <w:outlineLvl w:val="0"/>
+    </w:pPr>
+    <w:rPr>
+      <w:position w:val="-1"/>
+      <w:lang w:eastAsia="zh-CN"/>
+    </w:rPr>
+  </w:style>
+  <w:style w:type="paragraph" w:styleId="12">
+    <w:name w:val="Title"/>
+    <w:basedOn w:val="1"/>
+    <w:next w:val="11"/>
+    <w:qFormat/>
+    <w:uiPriority w:val="10"/>
+    <w:pPr>
+      <w:spacing w:line="1" w:lineRule="atLeast"/>
+      <w:ind w:left="-1" w:leftChars="-1" w:hanging="1" w:hangingChars="1"/>
+      <w:jc w:val="center"/>
+      <w:textAlignment w:val="top"/>
+      <w:outlineLvl w:val="0"/>
+    </w:pPr>
+    <w:rPr>
+      <w:b/>
+      <w:position w:val="-1"/>
+      <w:sz w:val="32"/>
+      <w:szCs w:val="20"/>
+      <w:lang w:eastAsia="zh-CN"/>
+    </w:rPr>
+  </w:style>
+  <w:style w:type="paragraph" w:styleId="13">
+    <w:name w:val="caption"/>
+    <w:basedOn w:val="1"/>
+    <w:uiPriority w:val="0"/>
+    <w:pPr>
+      <w:suppressLineNumbers/>
+      <w:spacing w:before="120" w:after="120" w:line="1" w:lineRule="atLeast"/>
+      <w:ind w:left="-1" w:leftChars="-1" w:hanging="1" w:hangingChars="1"/>
+      <w:textAlignment w:val="top"/>
+      <w:outlineLvl w:val="0"/>
+    </w:pPr>
+    <w:rPr>
+      <w:rFonts w:cs="Noto Sans Devanagari"/>
+      <w:i/>
+      <w:iCs/>
+      <w:position w:val="-1"/>
+      <w:lang w:eastAsia="zh-CN"/>
+    </w:rPr>
+  </w:style>
+  <w:style w:type="paragraph" w:styleId="14">
+    <w:name w:val="Subtitle"/>
+    <w:basedOn w:val="1"/>
+    <w:next w:val="1"/>
+    <w:qFormat/>
+    <w:uiPriority w:val="11"/>
+    <w:pPr>
+      <w:keepNext/>
+      <w:keepLines/>
+      <w:spacing w:before="360" w:after="80"/>
+    </w:pPr>
+    <w:rPr>
+      <w:rFonts w:ascii="Georgia" w:hAnsi="Georgia" w:eastAsia="Georgia" w:cs="Georgia"/>
+      <w:i/>
+      <w:color w:val="666666"/>
+      <w:sz w:val="48"/>
+      <w:szCs w:val="48"/>
+    </w:rPr>
+  </w:style>
+  <w:style w:type="paragraph" w:styleId="15">
+    <w:name w:val="Body Text Indent"/>
+    <w:basedOn w:val="1"/>
+    <w:uiPriority w:val="0"/>
+    <w:pPr>
+      <w:spacing w:line="1" w:lineRule="atLeast"/>
+      <w:ind w:left="284" w:leftChars="-1" w:hangingChars="1"/>
+      <w:textAlignment w:val="top"/>
+      <w:outlineLvl w:val="0"/>
+    </w:pPr>
+    <w:rPr>
+      <w:position w:val="-1"/>
+      <w:sz w:val="28"/>
+      <w:szCs w:val="20"/>
+      <w:lang w:eastAsia="zh-CN"/>
+    </w:rPr>
+  </w:style>
+  <w:style w:type="table" w:customStyle="1" w:styleId="16">
     <w:name w:val="TableNormal"/>
+    <w:uiPriority w:val="0"/>
     <w:tblPr>
       <w:tblCellMar>
         <w:top w:w="0" w:type="dxa"/>
@@ -1774,175 +1872,128 @@
       </w:tblCellMar>
     </w:tblPr>
   </w:style>
-  <w:style w:type="paragraph" w:styleId="Ttulo">
-    <w:name w:val="Title"/>
-    <w:basedOn w:val="Normal"/>
-    <w:next w:val="Corpodetexto"/>
-    <w:uiPriority w:val="10"/>
-    <w:qFormat/>
+  <w:style w:type="character" w:customStyle="1" w:styleId="17">
+    <w:name w:val="WW8Num2z0"/>
+    <w:uiPriority w:val="0"/>
+    <w:rPr>
+      <w:rFonts w:hint="default" w:ascii="Symbol" w:hAnsi="Symbol" w:cs="Symbol"/>
+      <w:w w:val="100"/>
+      <w:position w:val="-1"/>
+      <w:vertAlign w:val="baseline"/>
+      <w:cs w:val="0"/>
+    </w:rPr>
+  </w:style>
+  <w:style w:type="character" w:customStyle="1" w:styleId="18">
+    <w:name w:val="WW8Num1z0"/>
+    <w:uiPriority w:val="0"/>
+    <w:rPr>
+      <w:rFonts w:hint="default" w:ascii="Symbol" w:hAnsi="Symbol" w:cs="Symbol"/>
+      <w:w w:val="100"/>
+      <w:position w:val="-1"/>
+      <w:vertAlign w:val="baseline"/>
+      <w:cs w:val="0"/>
+    </w:rPr>
+  </w:style>
+  <w:style w:type="character" w:customStyle="1" w:styleId="19">
+    <w:name w:val="WW8Num3z0"/>
+    <w:uiPriority w:val="0"/>
+    <w:rPr>
+      <w:w w:val="100"/>
+      <w:position w:val="-1"/>
+      <w:vertAlign w:val="baseline"/>
+      <w:cs w:val="0"/>
+    </w:rPr>
+  </w:style>
+  <w:style w:type="character" w:customStyle="1" w:styleId="20">
+    <w:name w:val="WW8Num6z0"/>
+    <w:uiPriority w:val="0"/>
+    <w:rPr>
+      <w:w w:val="100"/>
+      <w:position w:val="-1"/>
+      <w:sz w:val="28"/>
+      <w:vertAlign w:val="baseline"/>
+      <w:cs w:val="0"/>
+    </w:rPr>
+  </w:style>
+  <w:style w:type="character" w:customStyle="1" w:styleId="21">
+    <w:name w:val="WW8Num7z0"/>
+    <w:uiPriority w:val="0"/>
+    <w:rPr>
+      <w:w w:val="100"/>
+      <w:position w:val="-1"/>
+      <w:sz w:val="28"/>
+      <w:vertAlign w:val="baseline"/>
+      <w:cs w:val="0"/>
+    </w:rPr>
+  </w:style>
+  <w:style w:type="character" w:customStyle="1" w:styleId="22">
+    <w:name w:val="WW8Num8z0"/>
+    <w:uiPriority w:val="0"/>
+    <w:rPr>
+      <w:w w:val="100"/>
+      <w:position w:val="-1"/>
+      <w:sz w:val="28"/>
+      <w:vertAlign w:val="baseline"/>
+      <w:cs w:val="0"/>
+    </w:rPr>
+  </w:style>
+  <w:style w:type="character" w:customStyle="1" w:styleId="23">
+    <w:name w:val="WW8Num9z0"/>
+    <w:uiPriority w:val="0"/>
+    <w:rPr>
+      <w:w w:val="100"/>
+      <w:position w:val="-1"/>
+      <w:vertAlign w:val="baseline"/>
+      <w:cs w:val="0"/>
+    </w:rPr>
+  </w:style>
+  <w:style w:type="character" w:customStyle="1" w:styleId="24">
+    <w:name w:val="WW8Num10z0"/>
+    <w:uiPriority w:val="0"/>
+    <w:rPr>
+      <w:w w:val="100"/>
+      <w:position w:val="-1"/>
+      <w:sz w:val="28"/>
+      <w:vertAlign w:val="baseline"/>
+      <w:cs w:val="0"/>
+    </w:rPr>
+  </w:style>
+  <w:style w:type="character" w:customStyle="1" w:styleId="25">
+    <w:name w:val="WW8Num12z0"/>
+    <w:uiPriority w:val="0"/>
+    <w:rPr>
+      <w:w w:val="100"/>
+      <w:position w:val="-1"/>
+      <w:sz w:val="28"/>
+      <w:vertAlign w:val="baseline"/>
+      <w:cs w:val="0"/>
+    </w:rPr>
+  </w:style>
+  <w:style w:type="paragraph" w:customStyle="1" w:styleId="26">
+    <w:name w:val="Índice"/>
+    <w:basedOn w:val="1"/>
+    <w:uiPriority w:val="0"/>
     <w:pPr>
+      <w:suppressLineNumbers/>
       <w:spacing w:line="1" w:lineRule="atLeast"/>
-      <w:ind w:leftChars="-1" w:left="-1" w:hangingChars="1" w:hanging="1"/>
-      <w:jc w:val="center"/>
-      <w:textDirection w:val="btLr"/>
+      <w:ind w:left="-1" w:leftChars="-1" w:hanging="1" w:hangingChars="1"/>
       <w:textAlignment w:val="top"/>
       <w:outlineLvl w:val="0"/>
     </w:pPr>
     <w:rPr>
-      <w:b/>
-      <w:position w:val="-1"/>
-      <w:sz w:val="32"/>
-      <w:szCs w:val="20"/>
-      <w:lang w:eastAsia="zh-CN"/>
-    </w:rPr>
-  </w:style>
-  <w:style w:type="table" w:customStyle="1" w:styleId="TableNormal0">
-    <w:name w:val="TableNormal"/>
-    <w:tblPr>
-      <w:tblCellMar>
-        <w:top w:w="0" w:type="dxa"/>
-        <w:left w:w="0" w:type="dxa"/>
-        <w:bottom w:w="0" w:type="dxa"/>
-        <w:right w:w="0" w:type="dxa"/>
-      </w:tblCellMar>
-    </w:tblPr>
-  </w:style>
-  <w:style w:type="character" w:customStyle="1" w:styleId="WW8Num2z0">
-    <w:name w:val="WW8Num2z0"/>
-    <w:rPr>
-      <w:rFonts w:ascii="Symbol" w:hAnsi="Symbol" w:cs="Symbol" w:hint="default"/>
-      <w:w w:val="100"/>
-      <w:position w:val="-1"/>
-      <w:effect w:val="none"/>
-      <w:vertAlign w:val="baseline"/>
-      <w:cs w:val="0"/>
-      <w:em w:val="none"/>
-    </w:rPr>
-  </w:style>
-  <w:style w:type="character" w:customStyle="1" w:styleId="WW8Num1z0">
-    <w:name w:val="WW8Num1z0"/>
-    <w:rPr>
-      <w:rFonts w:ascii="Symbol" w:hAnsi="Symbol" w:cs="Symbol" w:hint="default"/>
-      <w:w w:val="100"/>
-      <w:position w:val="-1"/>
-      <w:effect w:val="none"/>
-      <w:vertAlign w:val="baseline"/>
-      <w:cs w:val="0"/>
-      <w:em w:val="none"/>
-    </w:rPr>
-  </w:style>
-  <w:style w:type="character" w:customStyle="1" w:styleId="WW8Num3z0">
-    <w:name w:val="WW8Num3z0"/>
-    <w:rPr>
-      <w:w w:val="100"/>
-      <w:position w:val="-1"/>
-      <w:effect w:val="none"/>
-      <w:vertAlign w:val="baseline"/>
-      <w:cs w:val="0"/>
-      <w:em w:val="none"/>
-    </w:rPr>
-  </w:style>
-  <w:style w:type="character" w:customStyle="1" w:styleId="WW8Num6z0">
-    <w:name w:val="WW8Num6z0"/>
-    <w:rPr>
-      <w:w w:val="100"/>
-      <w:position w:val="-1"/>
-      <w:sz w:val="28"/>
-      <w:effect w:val="none"/>
-      <w:vertAlign w:val="baseline"/>
-      <w:cs w:val="0"/>
-      <w:em w:val="none"/>
-    </w:rPr>
-  </w:style>
-  <w:style w:type="character" w:customStyle="1" w:styleId="WW8Num7z0">
-    <w:name w:val="WW8Num7z0"/>
-    <w:rPr>
-      <w:w w:val="100"/>
-      <w:position w:val="-1"/>
-      <w:sz w:val="28"/>
-      <w:effect w:val="none"/>
-      <w:vertAlign w:val="baseline"/>
-      <w:cs w:val="0"/>
-      <w:em w:val="none"/>
-    </w:rPr>
-  </w:style>
-  <w:style w:type="character" w:customStyle="1" w:styleId="WW8Num8z0">
-    <w:name w:val="WW8Num8z0"/>
-    <w:rPr>
-      <w:w w:val="100"/>
-      <w:position w:val="-1"/>
-      <w:sz w:val="28"/>
-      <w:effect w:val="none"/>
-      <w:vertAlign w:val="baseline"/>
-      <w:cs w:val="0"/>
-      <w:em w:val="none"/>
-    </w:rPr>
-  </w:style>
-  <w:style w:type="character" w:customStyle="1" w:styleId="WW8Num9z0">
-    <w:name w:val="WW8Num9z0"/>
-    <w:rPr>
-      <w:w w:val="100"/>
-      <w:position w:val="-1"/>
-      <w:effect w:val="none"/>
-      <w:vertAlign w:val="baseline"/>
-      <w:cs w:val="0"/>
-      <w:em w:val="none"/>
-    </w:rPr>
-  </w:style>
-  <w:style w:type="character" w:customStyle="1" w:styleId="WW8Num10z0">
-    <w:name w:val="WW8Num10z0"/>
-    <w:rPr>
-      <w:w w:val="100"/>
-      <w:position w:val="-1"/>
-      <w:sz w:val="28"/>
-      <w:effect w:val="none"/>
-      <w:vertAlign w:val="baseline"/>
-      <w:cs w:val="0"/>
-      <w:em w:val="none"/>
-    </w:rPr>
-  </w:style>
-  <w:style w:type="character" w:customStyle="1" w:styleId="WW8Num12z0">
-    <w:name w:val="WW8Num12z0"/>
-    <w:rPr>
-      <w:w w:val="100"/>
-      <w:position w:val="-1"/>
-      <w:sz w:val="28"/>
-      <w:effect w:val="none"/>
-      <w:vertAlign w:val="baseline"/>
-      <w:cs w:val="0"/>
-      <w:em w:val="none"/>
-    </w:rPr>
-  </w:style>
-  <w:style w:type="paragraph" w:styleId="Corpodetexto">
-    <w:name w:val="Body Text"/>
-    <w:basedOn w:val="Normal"/>
-    <w:pPr>
-      <w:spacing w:after="140" w:line="276" w:lineRule="auto"/>
-      <w:ind w:leftChars="-1" w:left="-1" w:hangingChars="1" w:hanging="1"/>
-      <w:textDirection w:val="btLr"/>
-      <w:textAlignment w:val="top"/>
-      <w:outlineLvl w:val="0"/>
-    </w:pPr>
-    <w:rPr>
+      <w:rFonts w:cs="Noto Sans Devanagari"/>
       <w:position w:val="-1"/>
       <w:lang w:eastAsia="zh-CN"/>
     </w:rPr>
   </w:style>
-  <w:style w:type="paragraph" w:styleId="Lista">
-    <w:name w:val="List"/>
-    <w:basedOn w:val="Corpodetexto"/>
-    <w:rPr>
-      <w:rFonts w:cs="Noto Sans Devanagari"/>
-    </w:rPr>
-  </w:style>
-  <w:style w:type="paragraph" w:styleId="Legenda">
-    <w:name w:val="caption"/>
-    <w:basedOn w:val="Normal"/>
+  <w:style w:type="paragraph" w:customStyle="1" w:styleId="27">
+    <w:name w:val="Caption1"/>
+    <w:basedOn w:val="1"/>
+    <w:uiPriority w:val="0"/>
     <w:pPr>
       <w:suppressLineNumbers/>
       <w:spacing w:before="120" w:after="120" w:line="1" w:lineRule="atLeast"/>
-      <w:ind w:leftChars="-1" w:left="-1" w:hangingChars="1" w:hanging="1"/>
-      <w:textDirection w:val="btLr"/>
+      <w:ind w:left="-1" w:leftChars="-1" w:hanging="1" w:hangingChars="1"/>
       <w:textAlignment w:val="top"/>
       <w:outlineLvl w:val="0"/>
     </w:pPr>
@@ -1954,68 +2005,15 @@
       <w:lang w:eastAsia="zh-CN"/>
     </w:rPr>
   </w:style>
-  <w:style w:type="paragraph" w:customStyle="1" w:styleId="ndice">
-    <w:name w:val="Índice"/>
-    <w:basedOn w:val="Normal"/>
-    <w:pPr>
-      <w:suppressLineNumbers/>
-      <w:spacing w:line="1" w:lineRule="atLeast"/>
-      <w:ind w:leftChars="-1" w:left="-1" w:hangingChars="1" w:hanging="1"/>
-      <w:textDirection w:val="btLr"/>
-      <w:textAlignment w:val="top"/>
-      <w:outlineLvl w:val="0"/>
-    </w:pPr>
-    <w:rPr>
-      <w:rFonts w:cs="Noto Sans Devanagari"/>
-      <w:position w:val="-1"/>
-      <w:lang w:eastAsia="zh-CN"/>
-    </w:rPr>
-  </w:style>
-  <w:style w:type="paragraph" w:customStyle="1" w:styleId="Caption1">
-    <w:name w:val="Caption1"/>
-    <w:basedOn w:val="Normal"/>
-    <w:pPr>
-      <w:suppressLineNumbers/>
-      <w:spacing w:before="120" w:after="120" w:line="1" w:lineRule="atLeast"/>
-      <w:ind w:leftChars="-1" w:left="-1" w:hangingChars="1" w:hanging="1"/>
-      <w:textDirection w:val="btLr"/>
-      <w:textAlignment w:val="top"/>
-      <w:outlineLvl w:val="0"/>
-    </w:pPr>
-    <w:rPr>
-      <w:rFonts w:cs="Noto Sans Devanagari"/>
-      <w:i/>
-      <w:iCs/>
-      <w:position w:val="-1"/>
-      <w:lang w:eastAsia="zh-CN"/>
-    </w:rPr>
-  </w:style>
-  <w:style w:type="paragraph" w:styleId="Recuodecorpodetexto">
-    <w:name w:val="Body Text Indent"/>
-    <w:basedOn w:val="Normal"/>
-    <w:pPr>
-      <w:spacing w:line="1" w:lineRule="atLeast"/>
-      <w:ind w:leftChars="-1" w:left="284" w:hangingChars="1"/>
-      <w:textDirection w:val="btLr"/>
-      <w:textAlignment w:val="top"/>
-      <w:outlineLvl w:val="0"/>
-    </w:pPr>
-    <w:rPr>
-      <w:position w:val="-1"/>
-      <w:sz w:val="28"/>
-      <w:szCs w:val="20"/>
-      <w:lang w:eastAsia="zh-CN"/>
-    </w:rPr>
-  </w:style>
-  <w:style w:type="paragraph" w:customStyle="1" w:styleId="Contedodatabela">
+  <w:style w:type="paragraph" w:customStyle="1" w:styleId="28">
     <w:name w:val="Conteúdo da tabela"/>
-    <w:basedOn w:val="Normal"/>
+    <w:basedOn w:val="1"/>
+    <w:uiPriority w:val="0"/>
     <w:pPr>
       <w:widowControl w:val="0"/>
       <w:suppressLineNumbers/>
       <w:spacing w:line="1" w:lineRule="atLeast"/>
-      <w:ind w:leftChars="-1" w:left="-1" w:hangingChars="1" w:hanging="1"/>
-      <w:textDirection w:val="btLr"/>
+      <w:ind w:left="-1" w:leftChars="-1" w:hanging="1" w:hangingChars="1"/>
       <w:textAlignment w:val="top"/>
       <w:outlineLvl w:val="0"/>
     </w:pPr>
@@ -2024,9 +2022,10 @@
       <w:lang w:eastAsia="zh-CN"/>
     </w:rPr>
   </w:style>
-  <w:style w:type="paragraph" w:customStyle="1" w:styleId="Ttulodetabela">
+  <w:style w:type="paragraph" w:customStyle="1" w:styleId="29">
     <w:name w:val="Título de tabela"/>
-    <w:basedOn w:val="Contedodatabela"/>
+    <w:basedOn w:val="28"/>
+    <w:uiPriority w:val="0"/>
     <w:pPr>
       <w:jc w:val="center"/>
     </w:pPr>
@@ -2035,11 +2034,11 @@
       <w:bCs/>
     </w:rPr>
   </w:style>
-  <w:style w:type="table" w:customStyle="1" w:styleId="a">
-    <w:basedOn w:val="TableNormal0"/>
+  <w:style w:type="table" w:customStyle="1" w:styleId="30">
+    <w:name w:val="_Style 29"/>
+    <w:basedOn w:val="16"/>
+    <w:uiPriority w:val="0"/>
     <w:tblPr>
-      <w:tblStyleRowBandSize w:val="1"/>
-      <w:tblStyleColBandSize w:val="1"/>
       <w:tblCellMar>
         <w:top w:w="0" w:type="dxa"/>
         <w:left w:w="70" w:type="dxa"/>
@@ -2048,11 +2047,11 @@
       </w:tblCellMar>
     </w:tblPr>
   </w:style>
-  <w:style w:type="table" w:customStyle="1" w:styleId="a0">
-    <w:basedOn w:val="TableNormal0"/>
+  <w:style w:type="table" w:customStyle="1" w:styleId="31">
+    <w:name w:val="_Style 30"/>
+    <w:basedOn w:val="16"/>
+    <w:uiPriority w:val="0"/>
     <w:tblPr>
-      <w:tblStyleRowBandSize w:val="1"/>
-      <w:tblStyleColBandSize w:val="1"/>
       <w:tblCellMar>
         <w:top w:w="0" w:type="dxa"/>
         <w:left w:w="70" w:type="dxa"/>
@@ -2061,11 +2060,11 @@
       </w:tblCellMar>
     </w:tblPr>
   </w:style>
-  <w:style w:type="table" w:customStyle="1" w:styleId="a1">
-    <w:basedOn w:val="TableNormal0"/>
+  <w:style w:type="table" w:customStyle="1" w:styleId="32">
+    <w:name w:val="_Style 31"/>
+    <w:basedOn w:val="16"/>
+    <w:uiPriority w:val="0"/>
     <w:tblPr>
-      <w:tblStyleRowBandSize w:val="1"/>
-      <w:tblStyleColBandSize w:val="1"/>
       <w:tblCellMar>
         <w:top w:w="0" w:type="dxa"/>
         <w:left w:w="108" w:type="dxa"/>
@@ -2074,30 +2073,11 @@
       </w:tblCellMar>
     </w:tblPr>
   </w:style>
-  <w:style w:type="paragraph" w:styleId="Subttulo">
-    <w:name w:val="Subtitle"/>
-    <w:basedOn w:val="Normal"/>
-    <w:next w:val="Normal"/>
-    <w:uiPriority w:val="11"/>
-    <w:qFormat/>
-    <w:pPr>
-      <w:keepNext/>
-      <w:keepLines/>
-      <w:spacing w:before="360" w:after="80"/>
-    </w:pPr>
-    <w:rPr>
-      <w:rFonts w:ascii="Georgia" w:eastAsia="Georgia" w:hAnsi="Georgia" w:cs="Georgia"/>
-      <w:i/>
-      <w:color w:val="666666"/>
-      <w:sz w:val="48"/>
-      <w:szCs w:val="48"/>
-    </w:rPr>
-  </w:style>
-  <w:style w:type="table" w:customStyle="1" w:styleId="a2">
-    <w:basedOn w:val="TableNormal0"/>
+  <w:style w:type="table" w:customStyle="1" w:styleId="33">
+    <w:name w:val="_Style 33"/>
+    <w:basedOn w:val="16"/>
+    <w:uiPriority w:val="0"/>
     <w:tblPr>
-      <w:tblStyleRowBandSize w:val="1"/>
-      <w:tblStyleColBandSize w:val="1"/>
       <w:tblCellMar>
         <w:top w:w="0" w:type="dxa"/>
         <w:left w:w="70" w:type="dxa"/>
@@ -2106,11 +2086,11 @@
       </w:tblCellMar>
     </w:tblPr>
   </w:style>
-  <w:style w:type="table" w:customStyle="1" w:styleId="a3">
-    <w:basedOn w:val="TableNormal0"/>
+  <w:style w:type="table" w:customStyle="1" w:styleId="34">
+    <w:name w:val="_Style 34"/>
+    <w:basedOn w:val="16"/>
+    <w:uiPriority w:val="0"/>
     <w:tblPr>
-      <w:tblStyleRowBandSize w:val="1"/>
-      <w:tblStyleColBandSize w:val="1"/>
       <w:tblCellMar>
         <w:top w:w="0" w:type="dxa"/>
         <w:left w:w="108" w:type="dxa"/>
@@ -2438,7 +2418,6 @@
       </a:style>
     </a:lnDef>
   </a:objectDefaults>
-  <a:extraClrSchemeLst/>
 </a:theme>
 </file>
 
@@ -2450,9 +2429,6 @@
 
 <file path=customXml/itemProps1.xml><?xml version="1.0" encoding="utf-8"?>
 <ds:datastoreItem xmlns:ds="http://schemas.openxmlformats.org/officeDocument/2006/customXml" ds:itemID="{11111111-1234-1234-1234-123412341234}">
-  <ds:schemaRefs>
-    <ds:schemaRef ds:uri="http://customooxmlschemas.google.com/"/>
-    <ds:schemaRef ds:uri="http://schemas.openxmlformats.org/officeDocument/2006/relationships"/>
-  </ds:schemaRefs>
+  <ds:schemaRefs/>
 </ds:datastoreItem>
 </file>
</xml_diff>